<commit_message>
feat: Agent workflow + cloud deployment
- Add trip plan agent workflow (intent detection, context, sufficiency,
  route retrieval, evidence search, evaluation, response generation)
- Add LLM provider layer (OpenAI + mock) with agent tools (weather,
  search, transport)
- Add Docker-based cloud deployment: backend Dockerfile, frontend
  multi-stage build, nginx reverse proxy, docker-compose with PostgreSQL
- Add deploy_cloud.py one-click deployment script (package + upload +
  build + start on ECS)
- Update frontend: Chat/Plans/PlanDetail views, OpenAPI-generated types
- Add middleware docker-compose for local development

Co-Authored-By: Claude Opus 4.7 <noreply@anthropic.com>
</commit_message>
<xml_diff>
--- a/design_doc/智行户外PRD.docx
+++ b/design_doc/智行户外PRD.docx
@@ -69,16 +69,453 @@
           <w:rFonts w:hint="eastAsia"/>
         </w:rPr>
       </w:pPr>
+    </w:p>
+    <w:p>
+      <w:pPr>
+        <w:rPr>
+          <w:rFonts w:hint="eastAsia"/>
+        </w:rPr>
+      </w:pPr>
+      <w:r>
+        <w:br w:type="page"/>
+      </w:r>
+    </w:p>
+    <w:p>
+      <w:pPr>
+        <w:pStyle w:val="1"/>
+        <w:rPr>
+          <w:rFonts w:ascii="微软雅黑" w:eastAsia="微软雅黑" w:hAnsi="微软雅黑"/>
+          <w:color w:val="1F6F8B"/>
+          <w:sz w:val="32"/>
+          <w:szCs w:val="32"/>
+          <w:lang w:eastAsia="zh-CN"/>
+        </w:rPr>
+      </w:pPr>
+      <w:r>
+        <w:rPr>
+          <w:rFonts w:ascii="微软雅黑" w:eastAsia="微软雅黑" w:hAnsi="微软雅黑"/>
+          <w:color w:val="1F6F8B"/>
+          <w:sz w:val="32"/>
+          <w:szCs w:val="32"/>
+          <w:lang w:eastAsia="zh-CN"/>
+        </w:rPr>
+        <w:lastRenderedPageBreak/>
+        <w:t>模块一：用户洞察与问题定义</w:t>
+      </w:r>
+    </w:p>
+    <w:p>
+      <w:pPr>
+        <w:pStyle w:val="21"/>
+        <w:numPr>
+          <w:ilvl w:val="1"/>
+          <w:numId w:val="13"/>
+        </w:numPr>
+        <w:rPr>
+          <w:rFonts w:ascii="宋体" w:eastAsia="宋体" w:hAnsi="宋体" w:hint="eastAsia"/>
+          <w:lang w:eastAsia="zh-CN"/>
+        </w:rPr>
+      </w:pPr>
+      <w:r>
+        <w:rPr>
+          <w:rFonts w:ascii="宋体" w:eastAsia="宋体" w:hAnsi="宋体" w:hint="eastAsia"/>
+          <w:lang w:eastAsia="zh-CN"/>
+        </w:rPr>
+        <w:t>目标用户</w:t>
+      </w:r>
+    </w:p>
+    <w:p>
+      <w:pPr>
+        <w:spacing w:after="0"/>
+        <w:rPr>
+          <w:rFonts w:hint="eastAsia"/>
+          <w:lang w:eastAsia="zh-CN"/>
+        </w:rPr>
+      </w:pPr>
+      <w:r>
+        <w:rPr>
+          <w:rFonts w:hint="eastAsia"/>
+          <w:lang w:eastAsia="zh-CN"/>
+        </w:rPr>
+        <w:t>本项目面向的目标客户是</w:t>
+      </w:r>
+      <w:r>
+        <w:rPr>
+          <w:b/>
+          <w:bCs/>
+          <w:lang w:eastAsia="zh-CN"/>
+        </w:rPr>
+        <w:t>轻中度户外用户</w:t>
+      </w:r>
+      <w:r>
+        <w:rPr>
+          <w:lang w:eastAsia="zh-CN"/>
+        </w:rPr>
+        <w:t>（例如：大学生群体等大众户外参与者）</w:t>
+      </w:r>
+      <w:r>
+        <w:rPr>
+          <w:rFonts w:hint="eastAsia"/>
+          <w:lang w:eastAsia="zh-CN"/>
+        </w:rPr>
+        <w:t>。</w:t>
+      </w:r>
+      <w:r>
+        <w:rPr>
+          <w:rFonts w:hint="eastAsia"/>
+          <w:lang w:eastAsia="zh-CN"/>
+        </w:rPr>
+        <w:t>我利用</w:t>
+      </w:r>
+      <w:r>
+        <w:rPr>
+          <w:rFonts w:hint="eastAsia"/>
+          <w:lang w:eastAsia="zh-CN"/>
+        </w:rPr>
+        <w:t>参与和组织校内的户外运动活动</w:t>
+      </w:r>
+      <w:r>
+        <w:rPr>
+          <w:rFonts w:hint="eastAsia"/>
+          <w:lang w:eastAsia="zh-CN"/>
+        </w:rPr>
+        <w:t>的时间</w:t>
+      </w:r>
+      <w:r>
+        <w:rPr>
+          <w:rFonts w:hint="eastAsia"/>
+          <w:lang w:eastAsia="zh-CN"/>
+        </w:rPr>
+        <w:t>，对目标客户特征的调查和观察。</w:t>
+      </w:r>
+      <w:r>
+        <w:rPr>
+          <w:rFonts w:hint="eastAsia"/>
+          <w:lang w:eastAsia="zh-CN"/>
+        </w:rPr>
+        <w:t>他们的的特征可以被概括为两个维度：行为特征和能力特征。</w:t>
+      </w:r>
+    </w:p>
+    <w:p>
+      <w:pPr>
+        <w:spacing w:after="0" w:line="283" w:lineRule="auto"/>
+        <w:rPr>
+          <w:rFonts w:hint="eastAsia"/>
+          <w:lang w:eastAsia="zh-CN"/>
+        </w:rPr>
+      </w:pPr>
+      <w:r>
+        <w:rPr>
+          <w:b/>
+          <w:bCs/>
+          <w:lang w:eastAsia="zh-CN"/>
+        </w:rPr>
+        <w:t>身份/行为特征</w:t>
+      </w:r>
+      <w:r>
+        <w:rPr>
+          <w:lang w:eastAsia="zh-CN"/>
+        </w:rPr>
+        <w:t>：有出行意愿，且具有一定的风险意识。他们通常已经把户外运动作为大众生活方式的一部分，</w:t>
+      </w:r>
+      <w:r>
+        <w:rPr>
+          <w:rFonts w:hint="eastAsia"/>
+          <w:lang w:eastAsia="zh-CN"/>
+        </w:rPr>
+        <w:t>。他们不是完全的小白，对户外一窍不通，知道基础的轨迹使用。同时他们也</w:t>
+      </w:r>
+      <w:r>
+        <w:rPr>
+          <w:lang w:eastAsia="zh-CN"/>
+        </w:rPr>
+        <w:t>不是极限探险者</w:t>
+      </w:r>
+      <w:r>
+        <w:rPr>
+          <w:rFonts w:hint="eastAsia"/>
+          <w:lang w:eastAsia="zh-CN"/>
+        </w:rPr>
+        <w:t>，他们把户外当作日常放松身心的一种方式。</w:t>
+      </w:r>
+    </w:p>
+    <w:p>
+      <w:pPr>
+        <w:spacing w:after="0" w:line="283" w:lineRule="auto"/>
+        <w:rPr>
+          <w:lang w:eastAsia="zh-CN"/>
+        </w:rPr>
+      </w:pPr>
+      <w:r>
+        <w:rPr>
+          <w:b/>
+          <w:bCs/>
+          <w:lang w:eastAsia="zh-CN"/>
+        </w:rPr>
+        <w:t>能力特征</w:t>
+      </w:r>
+      <w:r>
+        <w:rPr>
+          <w:lang w:eastAsia="zh-CN"/>
+        </w:rPr>
+        <w:t>：缺乏稳定的信息整合能力和专业路线判断能力。他们可能知道小红书、两步路、地图和天气工具，但没有足够的经验去综合判断“这条线路对我这次是否合适”。</w:t>
+      </w:r>
+      <w:r>
+        <w:rPr>
+          <w:rFonts w:hint="eastAsia"/>
+          <w:lang w:eastAsia="zh-CN"/>
+        </w:rPr>
+        <w:t>同时户外只是日常生活的一部分，他们无法抽空出足够时间进行详细的信息整合和调研。</w:t>
+      </w:r>
+    </w:p>
+    <w:p>
+      <w:pPr>
+        <w:pStyle w:val="21"/>
+        <w:numPr>
+          <w:ilvl w:val="1"/>
+          <w:numId w:val="13"/>
+        </w:numPr>
+        <w:rPr>
+          <w:rFonts w:ascii="宋体" w:eastAsia="宋体" w:hAnsi="宋体"/>
+          <w:lang w:eastAsia="zh-CN"/>
+        </w:rPr>
+      </w:pPr>
+      <w:r>
+        <w:rPr>
+          <w:rFonts w:ascii="宋体" w:eastAsia="宋体" w:hAnsi="宋体" w:hint="eastAsia"/>
+          <w:lang w:eastAsia="zh-CN"/>
+        </w:rPr>
+        <w:t>用户痛点</w:t>
+      </w:r>
+    </w:p>
+    <w:p>
+      <w:pPr>
+        <w:spacing w:after="0"/>
+        <w:rPr>
+          <w:rFonts w:hint="eastAsia"/>
+          <w:lang w:eastAsia="zh-CN"/>
+        </w:rPr>
+      </w:pPr>
+      <w:r>
+        <w:rPr>
+          <w:rFonts w:hint="eastAsia"/>
+          <w:lang w:eastAsia="zh-CN"/>
+        </w:rPr>
+        <w:t>用户的核心痛点在于：</w:t>
+      </w:r>
+      <w:r>
+        <w:rPr>
+          <w:rFonts w:hint="eastAsia"/>
+          <w:lang w:eastAsia="zh-CN"/>
+        </w:rPr>
+        <w:t>在进行出行目的地决策时候，</w:t>
+      </w:r>
+      <w:r>
+        <w:rPr>
+          <w:rFonts w:hint="eastAsia"/>
+          <w:b/>
+          <w:bCs/>
+          <w:lang w:eastAsia="zh-CN"/>
+        </w:rPr>
+        <w:t>缺乏从</w:t>
+      </w:r>
+      <w:r>
+        <w:rPr>
+          <w:rFonts w:hint="eastAsia"/>
+          <w:b/>
+          <w:bCs/>
+          <w:lang w:eastAsia="zh-CN"/>
+        </w:rPr>
+        <w:t>模糊宽泛的需求</w:t>
+      </w:r>
+      <w:r>
+        <w:rPr>
+          <w:rFonts w:hint="eastAsia"/>
+          <w:b/>
+          <w:bCs/>
+          <w:lang w:eastAsia="zh-CN"/>
+        </w:rPr>
+        <w:t>到真实决策的桥梁</w:t>
+      </w:r>
+      <w:r>
+        <w:rPr>
+          <w:rFonts w:hint="eastAsia"/>
+          <w:lang w:eastAsia="zh-CN"/>
+        </w:rPr>
+        <w:t>。 具体的痛点表现与佐证如下：</w:t>
+      </w:r>
+    </w:p>
+    <w:p>
+      <w:pPr>
+        <w:pStyle w:val="ae"/>
+        <w:numPr>
+          <w:ilvl w:val="0"/>
+          <w:numId w:val="14"/>
+        </w:numPr>
+        <w:spacing w:after="0"/>
+        <w:rPr>
+          <w:rFonts w:hint="eastAsia"/>
+          <w:lang w:eastAsia="zh-CN"/>
+        </w:rPr>
+      </w:pPr>
+      <w:r>
+        <w:rPr>
+          <w:rFonts w:hint="eastAsia"/>
+          <w:lang w:eastAsia="zh-CN"/>
+        </w:rPr>
+        <w:t>不知道去哪（信息多但难决策）：热门平台上的内容推荐不等于适合自己个人的真实需求</w:t>
+      </w:r>
+      <w:r>
+        <w:rPr>
+          <w:rFonts w:hint="eastAsia"/>
+          <w:lang w:eastAsia="zh-CN"/>
+        </w:rPr>
+        <w:t>，小红书上信息丰富，能够快速了解特色风景，但是专业性严重不足。两步路专业性足够，但是对于风景，路况，近期天气条件一无所知。</w:t>
+      </w:r>
+      <w:r>
+        <w:rPr>
+          <w:rFonts w:hint="eastAsia"/>
+          <w:lang w:eastAsia="zh-CN"/>
+        </w:rPr>
+        <w:t>信息泛滥但不可直接作为决策依据。</w:t>
+      </w:r>
+    </w:p>
+    <w:p>
+      <w:pPr>
+        <w:pStyle w:val="ae"/>
+        <w:numPr>
+          <w:ilvl w:val="0"/>
+          <w:numId w:val="14"/>
+        </w:numPr>
+        <w:spacing w:after="0"/>
+        <w:rPr>
+          <w:rFonts w:hint="eastAsia"/>
+          <w:lang w:eastAsia="zh-CN"/>
+        </w:rPr>
+      </w:pPr>
+      <w:r>
+        <w:rPr>
+          <w:rFonts w:hint="eastAsia"/>
+          <w:lang w:eastAsia="zh-CN"/>
+        </w:rPr>
+        <w:t>不知道能不能走（能力难匹配）：专业的轨迹指标（</w:t>
+      </w:r>
+      <w:r>
+        <w:rPr>
+          <w:rFonts w:hint="eastAsia"/>
+          <w:lang w:eastAsia="zh-CN"/>
+        </w:rPr>
+        <w:t>以</w:t>
+      </w:r>
+      <w:r>
+        <w:rPr>
+          <w:rFonts w:hint="eastAsia"/>
+          <w:lang w:eastAsia="zh-CN"/>
+        </w:rPr>
+        <w:t>距离、爬升、海拔）难以与用户个人的真实体能状态相关联。</w:t>
+      </w:r>
+      <w:r>
+        <w:rPr>
+          <w:rFonts w:hint="eastAsia"/>
+          <w:lang w:eastAsia="zh-CN"/>
+        </w:rPr>
+        <w:t>同时，影响线路难度的变量不局限于轨迹指标，还取决于路况，线路可抵达性，救援</w:t>
+      </w:r>
+    </w:p>
+    <w:p>
+      <w:pPr>
+        <w:pStyle w:val="ae"/>
+        <w:numPr>
+          <w:ilvl w:val="0"/>
+          <w:numId w:val="14"/>
+        </w:numPr>
+        <w:spacing w:after="0"/>
+        <w:rPr>
+          <w:rFonts w:hint="eastAsia"/>
+          <w:lang w:eastAsia="zh-CN"/>
+        </w:rPr>
+      </w:pPr>
+      <w:r>
+        <w:rPr>
+          <w:rFonts w:hint="eastAsia"/>
+          <w:lang w:eastAsia="zh-CN"/>
+        </w:rPr>
+        <w:t>不知道是否可成行（信息太碎片）：交通、天气、返程、近期路况等影响出行的关键因素，分散在多个不同的渠道（应用）中</w:t>
+      </w:r>
+      <w:r>
+        <w:rPr>
+          <w:rFonts w:hint="eastAsia"/>
+          <w:lang w:eastAsia="zh-CN"/>
+        </w:rPr>
+        <w:t>。</w:t>
+      </w:r>
+    </w:p>
+    <w:p>
+      <w:pPr>
+        <w:pStyle w:val="ae"/>
+        <w:numPr>
+          <w:ilvl w:val="0"/>
+          <w:numId w:val="14"/>
+        </w:numPr>
+        <w:spacing w:after="0"/>
+        <w:rPr>
+          <w:lang w:eastAsia="zh-CN"/>
+        </w:rPr>
+      </w:pPr>
+      <w:r>
+        <w:rPr>
+          <w:rFonts w:hint="eastAsia"/>
+          <w:lang w:eastAsia="zh-CN"/>
+        </w:rPr>
+        <w:t>决策协作难（想约朋友）：在与朋友共同决策时，缺乏一个可转发、可解释、信息密度适中的方案载体。</w:t>
+      </w:r>
+    </w:p>
+    <w:p>
+      <w:pPr>
+        <w:spacing w:after="0"/>
+        <w:rPr>
+          <w:rFonts w:hint="eastAsia"/>
+          <w:lang w:eastAsia="zh-CN"/>
+        </w:rPr>
+      </w:pPr>
+      <w:r>
+        <w:rPr>
+          <w:rFonts w:hint="eastAsia"/>
+          <w:lang w:eastAsia="zh-CN"/>
+        </w:rPr>
+        <w:t>以上表现的作证案例是一份主要面向大学生群体的调查问卷（样本量N = 150）。</w:t>
+      </w:r>
+      <w:r>
+        <w:rPr>
+          <w:rFonts w:hint="eastAsia"/>
+          <w:lang w:eastAsia="zh-CN"/>
+        </w:rPr>
+        <w:t>问卷显示，用户日常需要在小红书（看推荐）、两步路（找轨迹）、地图、天气、交通工具之间反复切换。</w:t>
+      </w:r>
+      <w:r>
+        <w:rPr>
+          <w:rFonts w:hint="eastAsia"/>
+          <w:lang w:eastAsia="zh-CN"/>
+        </w:rPr>
+        <w:t>接近六成的同学都需要在户外线路查询上花费10分钟以上。</w:t>
+      </w:r>
+    </w:p>
+    <w:p>
+      <w:pPr>
+        <w:spacing w:after="0"/>
+        <w:rPr>
+          <w:lang w:eastAsia="zh-CN"/>
+        </w:rPr>
+      </w:pPr>
       <w:r>
         <w:rPr>
           <w:noProof/>
         </w:rPr>
         <w:lastRenderedPageBreak/>
         <w:drawing>
-          <wp:inline distT="0" distB="0" distL="0" distR="0" wp14:anchorId="168C33A7" wp14:editId="1BA65CA5">
-            <wp:extent cx="5806440" cy="7419340"/>
-            <wp:effectExtent l="0" t="0" r="0" b="0"/>
-            <wp:docPr id="2" name="Picture 2"/>
+          <wp:inline distT="0" distB="0" distL="0" distR="0" wp14:anchorId="1549616B" wp14:editId="389E5044">
+            <wp:extent cx="6512560" cy="2490470"/>
+            <wp:effectExtent l="0" t="0" r="2540" b="5080"/>
+            <wp:docPr id="1868687990" name="图片 1"/>
             <wp:cNvGraphicFramePr>
               <a:graphicFrameLocks xmlns:a="http://schemas.openxmlformats.org/drawingml/2006/main" noChangeAspect="1"/>
             </wp:cNvGraphicFramePr>
@@ -86,23 +523,36 @@
               <a:graphicData uri="http://schemas.openxmlformats.org/drawingml/2006/picture">
                 <pic:pic xmlns:pic="http://schemas.openxmlformats.org/drawingml/2006/picture">
                   <pic:nvPicPr>
-                    <pic:cNvPr id="0" name="toc.png"/>
-                    <pic:cNvPicPr/>
+                    <pic:cNvPr id="0" name="Picture 1"/>
+                    <pic:cNvPicPr>
+                      <a:picLocks noChangeAspect="1" noChangeArrowheads="1"/>
+                    </pic:cNvPicPr>
                   </pic:nvPicPr>
                   <pic:blipFill>
-                    <a:blip r:embed="rId9"/>
+                    <a:blip r:embed="rId9">
+                      <a:extLst>
+                        <a:ext uri="{28A0092B-C50C-407E-A947-70E740481C1C}">
+                          <a14:useLocalDpi xmlns:a14="http://schemas.microsoft.com/office/drawing/2010/main" val="0"/>
+                        </a:ext>
+                      </a:extLst>
+                    </a:blip>
+                    <a:srcRect/>
                     <a:stretch>
                       <a:fillRect/>
                     </a:stretch>
                   </pic:blipFill>
-                  <pic:spPr>
+                  <pic:spPr bwMode="auto">
                     <a:xfrm>
                       <a:off x="0" y="0"/>
-                      <a:ext cx="5806440" cy="7419340"/>
+                      <a:ext cx="6512560" cy="2490470"/>
                     </a:xfrm>
                     <a:prstGeom prst="rect">
                       <a:avLst/>
                     </a:prstGeom>
+                    <a:noFill/>
+                    <a:ln>
+                      <a:noFill/>
+                    </a:ln>
                   </pic:spPr>
                 </pic:pic>
               </a:graphicData>
@@ -113,16 +563,90 @@
     </w:p>
     <w:p>
       <w:pPr>
+        <w:spacing w:after="0"/>
+        <w:jc w:val="center"/>
         <w:rPr>
           <w:rFonts w:hint="eastAsia"/>
-        </w:rPr>
-      </w:pPr>
-      <w:r>
-        <w:br w:type="page"/>
+          <w:lang w:eastAsia="zh-CN"/>
+        </w:rPr>
+      </w:pPr>
+      <w:r>
+        <w:rPr>
+          <w:rFonts w:hint="eastAsia"/>
+          <w:lang w:eastAsia="zh-CN"/>
+        </w:rPr>
+        <w:t>图1 攻略查询用时</w:t>
       </w:r>
     </w:p>
     <w:p>
       <w:pPr>
+        <w:spacing w:after="140" w:line="283" w:lineRule="auto"/>
+        <w:rPr>
+          <w:rFonts w:hint="eastAsia"/>
+          <w:lang w:eastAsia="zh-CN"/>
+        </w:rPr>
+      </w:pPr>
+      <w:r>
+        <w:rPr>
+          <w:lang w:eastAsia="zh-CN"/>
+        </w:rPr>
+        <w:t>第一阶段采用</w:t>
+      </w:r>
+      <w:r>
+        <w:rPr>
+          <w:rFonts w:hint="eastAsia"/>
+          <w:lang w:eastAsia="zh-CN"/>
+        </w:rPr>
+        <w:t>移动端Web端作为用户界面。</w:t>
+      </w:r>
+      <w:r>
+        <w:rPr>
+          <w:lang w:eastAsia="zh-CN"/>
+        </w:rPr>
+        <w:t xml:space="preserve">React H5，而不是小程序或原生 App。这个选择是为了以最短路径验证核心假设：对话 Agent 是否能基于线路库、轨迹解析和能力画像给出真正有用的候选线路。小程序和 App 在分发、分享和行中能力上有长期价值，但会引入备案、审核、地图适配、权限和上架成本，不适合作为 Demo </w:t>
+      </w:r>
+      <w:r>
+        <w:rPr>
+          <w:rFonts w:hint="eastAsia"/>
+          <w:lang w:eastAsia="zh-CN"/>
+        </w:rPr>
+        <w:t>阶段的产出。</w:t>
+      </w:r>
+    </w:p>
+    <w:p>
+      <w:pPr>
+        <w:spacing w:after="140" w:line="283" w:lineRule="auto"/>
+        <w:ind w:firstLine="720"/>
+        <w:rPr>
+          <w:rFonts w:hint="eastAsia"/>
+          <w:lang w:eastAsia="zh-CN"/>
+        </w:rPr>
+      </w:pPr>
+      <w:r>
+        <w:rPr>
+          <w:lang w:eastAsia="zh-CN"/>
+        </w:rPr>
+        <w:t>MVP 的价值闭环是：用户通过表达模糊意图，系统主动理解并抽取出发位置、时间窗口、交通方式、同行者、能力状态、偏好目标等上下文；系统从 RouteAsset 线路资产库中进行混合召回，结合能力画像和轨迹指标筛选候选；再通过交通、天气、外部搜索和证据验证形成三张候选卡片；用户点击任一卡片即可获得个性化线路方案，并可以保存到我的规划或复制分享文本。</w:t>
+      </w:r>
+    </w:p>
+    <w:p>
+      <w:pPr>
+        <w:spacing w:after="140" w:line="283" w:lineRule="auto"/>
+        <w:ind w:firstLine="720"/>
+        <w:rPr>
+          <w:rFonts w:hint="eastAsia"/>
+          <w:lang w:eastAsia="zh-CN"/>
+        </w:rPr>
+      </w:pPr>
+      <w:r>
+        <w:rPr>
+          <w:lang w:eastAsia="zh-CN"/>
+        </w:rPr>
+        <w:t>关键取舍是放弃强制的“选择线路-确认选择-生成攻略”流程。用户看到详情后直接保存、分享、离开或继续追问，都是有效行为。方案卡本身就是一次价值交付，不把用户锁进线性工作流。</w:t>
+      </w:r>
+    </w:p>
+    <w:p>
+      <w:pPr>
         <w:pStyle w:val="1"/>
         <w:rPr>
           <w:lang w:eastAsia="zh-CN"/>
@@ -134,8 +658,7 @@
           <w:color w:val="1F6F8B"/>
           <w:lang w:eastAsia="zh-CN"/>
         </w:rPr>
-        <w:lastRenderedPageBreak/>
-        <w:t>1. 执行摘要</w:t>
+        <w:t>2. 市场与行业分析</w:t>
       </w:r>
     </w:p>
     <w:p>
@@ -151,7 +674,7 @@
         <w:rPr>
           <w:lang w:eastAsia="zh-CN"/>
         </w:rPr>
-        <w:t>Outdoor-Agent-Planner 的重构方向不是把现有天气、搜索、交通、轨迹等工具页面重新排列，而是把产品重新定义为一个任务驱动的户外规划 Agent。用户的真实目标通常不是“查一个指标”，而是“这个周末我到底去哪、这条线我能不能走、能不能约朋友一起去”。因此，新产品的核心交付物不是聊天记录，也不是普通线路详情，而是基于用户本次规划上下文和真实轨迹资产生成的</w:t>
+        <w:t>中国户外运动正在从小众兴趣进入大众生活方式。政策层面，国家体育总局等部门发布的《户外运动产业发展规划（2022-2025年）》明确提出，到 2025 年户外运动产业总规模超过 3 万亿元。参与层面，公开报道显示，截至 2025 年 4 月初，</w:t>
       </w:r>
       <w:r>
         <w:rPr>
@@ -159,13 +682,13 @@
           <w:bCs/>
           <w:lang w:eastAsia="zh-CN"/>
         </w:rPr>
-        <w:t>可决策线路方案</w:t>
-      </w:r>
-      <w:r>
-        <w:rPr>
-          <w:lang w:eastAsia="zh-CN"/>
-        </w:rPr>
-        <w:t>。</w:t>
+        <w:t xml:space="preserve">中国户外运动参与人数已突破 4 </w:t>
+      </w:r>
+      <w:r>
+        <w:rPr>
+          <w:lang w:eastAsia="zh-CN"/>
+        </w:rPr>
+        <w:t>亿。供给层面，户外相关企业、步道、露营、冰雪、水上运动等细分场景快速增长。这说明户外不是单点工具市场，而是一个以目的地、线路、装备、交通、内容、社交和安全服务共同构成的复合型场景。</w:t>
       </w:r>
     </w:p>
     <w:p>
@@ -181,13 +704,19 @@
         <w:rPr>
           <w:lang w:eastAsia="zh-CN"/>
         </w:rPr>
-        <w:t>本 PRD 面向两类读者：一类是融资/路演场景中的业务判断者，需要快速理解市场潜力、用户价值和差异化壁垒；另一类是后续参与重构的产品、设计、后端、前端和 Agent 工程团队，需要明确对象边界、状态设计、模块关系和落地优先级。文档正文保持商业可读性，技术细节集中在后文附录。</w:t>
+        <w:t>美国市场可作为成熟市场参照。美国 BEA 发布的 2024 年户外休闲经济数据表明，美国户外休闲经济增加值为 6967 亿美元，占当年 GDP 的 2.4%。OIA/Outdoor Foundation 的参与趋势数据显示，美国 2024 年户外参与人数达到 1.811 亿，占 6 岁及以上人口 58.6%。中美数据口径不同，中国的 3 万亿元是产业规模目</w:t>
+      </w:r>
+      <w:r>
+        <w:rPr>
+          <w:lang w:eastAsia="zh-CN"/>
+        </w:rPr>
+        <w:lastRenderedPageBreak/>
+        <w:t>标，美国 BEA 是 GDP 增加值，因此不能直接比较绝对数值，但可以说明户外运动在成熟市场中具有稳定经济贡献和高参与渗透。</w:t>
       </w:r>
     </w:p>
     <w:p>
       <w:pPr>
-        <w:spacing w:after="140" w:line="283" w:lineRule="auto"/>
-        <w:ind w:firstLine="720"/>
+        <w:jc w:val="center"/>
         <w:rPr>
           <w:rFonts w:hint="eastAsia"/>
           <w:lang w:eastAsia="zh-CN"/>
@@ -195,222 +724,8 @@
       </w:pPr>
       <w:r>
         <w:rPr>
-          <w:lang w:eastAsia="zh-CN"/>
-        </w:rPr>
-        <w:t>第一阶段采用</w:t>
-      </w:r>
-      <w:r>
-        <w:rPr>
-          <w:rFonts w:hint="eastAsia"/>
-          <w:lang w:eastAsia="zh-CN"/>
-        </w:rPr>
-        <w:t>移动端Web</w:t>
-      </w:r>
-      <w:proofErr w:type="gramStart"/>
-      <w:r>
-        <w:rPr>
-          <w:rFonts w:hint="eastAsia"/>
-          <w:lang w:eastAsia="zh-CN"/>
-        </w:rPr>
-        <w:t>端作为</w:t>
-      </w:r>
-      <w:proofErr w:type="gramEnd"/>
-      <w:r>
-        <w:rPr>
-          <w:rFonts w:hint="eastAsia"/>
-          <w:lang w:eastAsia="zh-CN"/>
-        </w:rPr>
-        <w:t>用户界面。</w:t>
-      </w:r>
-      <w:r>
-        <w:rPr>
-          <w:lang w:eastAsia="zh-CN"/>
-        </w:rPr>
-        <w:t>React H5，而不是小程序或原生 App。这个选择是为了以最短路径验证核心假设：对话 Agent 是否能基于线路库、轨迹解析和能力画像给出真正有用的候选线路。小程序和 App 在分发、分享和行</w:t>
-      </w:r>
-      <w:proofErr w:type="gramStart"/>
-      <w:r>
-        <w:rPr>
-          <w:lang w:eastAsia="zh-CN"/>
-        </w:rPr>
-        <w:t>中能力</w:t>
-      </w:r>
-      <w:proofErr w:type="gramEnd"/>
-      <w:r>
-        <w:rPr>
-          <w:lang w:eastAsia="zh-CN"/>
-        </w:rPr>
-        <w:t xml:space="preserve">上有长期价值，但会引入备案、审核、地图适配、权限和上架成本，不适合作为 Demo </w:t>
-      </w:r>
-      <w:r>
-        <w:rPr>
-          <w:rFonts w:hint="eastAsia"/>
-          <w:lang w:eastAsia="zh-CN"/>
-        </w:rPr>
-        <w:t>阶段的产出。</w:t>
-      </w:r>
-    </w:p>
-    <w:p>
-      <w:pPr>
-        <w:spacing w:after="140" w:line="283" w:lineRule="auto"/>
-        <w:ind w:firstLine="720"/>
-        <w:rPr>
-          <w:rFonts w:hint="eastAsia"/>
-          <w:lang w:eastAsia="zh-CN"/>
-        </w:rPr>
-      </w:pPr>
-      <w:r>
-        <w:rPr>
-          <w:lang w:eastAsia="zh-CN"/>
-        </w:rPr>
-        <w:t>MVP 的价值闭环是：用户通过「</w:t>
-      </w:r>
-      <w:r>
-        <w:rPr>
-          <w:lang w:eastAsia="zh-CN"/>
-        </w:rPr>
-        <w:t>智行</w:t>
-      </w:r>
-      <w:r>
-        <w:rPr>
-          <w:lang w:eastAsia="zh-CN"/>
-        </w:rPr>
-        <w:t>」表达模糊意图，系统</w:t>
-      </w:r>
-      <w:proofErr w:type="gramStart"/>
-      <w:r>
-        <w:rPr>
-          <w:lang w:eastAsia="zh-CN"/>
-        </w:rPr>
-        <w:t>主动理解</w:t>
-      </w:r>
-      <w:proofErr w:type="gramEnd"/>
-      <w:r>
-        <w:rPr>
-          <w:lang w:eastAsia="zh-CN"/>
-        </w:rPr>
-        <w:t>并抽取出发位置、时间窗口、交通方式、同行者、能力状态、偏好目标等上下文；系统从 RouteAsset 线路资产库中进行混合召回，结合能力画像和轨迹指标筛选候选；再通过交通、天气、外部搜索和证据验证形成三张候选卡片；用户点击任</w:t>
-      </w:r>
-      <w:proofErr w:type="gramStart"/>
-      <w:r>
-        <w:rPr>
-          <w:lang w:eastAsia="zh-CN"/>
-        </w:rPr>
-        <w:t>一</w:t>
-      </w:r>
-      <w:proofErr w:type="gramEnd"/>
-      <w:r>
-        <w:rPr>
-          <w:lang w:eastAsia="zh-CN"/>
-        </w:rPr>
-        <w:t>卡片即可获得个性化线路方案，并可以保存到我的规划或复制分享文本。</w:t>
-      </w:r>
-    </w:p>
-    <w:p>
-      <w:pPr>
-        <w:spacing w:after="140" w:line="283" w:lineRule="auto"/>
-        <w:ind w:firstLine="720"/>
-        <w:rPr>
-          <w:rFonts w:hint="eastAsia"/>
-          <w:lang w:eastAsia="zh-CN"/>
-        </w:rPr>
-      </w:pPr>
-      <w:r>
-        <w:rPr>
-          <w:lang w:eastAsia="zh-CN"/>
-        </w:rPr>
-        <w:t>关键取舍是放弃强制的“选择线路-确认选择-生成攻略”流程。用户看到详情后直接保存、分享、离开或继续追问，都是有效行为。方案卡本身就是一次价值交付，不把用户锁进线性工作流。</w:t>
-      </w:r>
-    </w:p>
-    <w:p>
-      <w:pPr>
-        <w:pStyle w:val="1"/>
-        <w:rPr>
-          <w:lang w:eastAsia="zh-CN"/>
-        </w:rPr>
-      </w:pPr>
-      <w:r>
-        <w:rPr>
-          <w:rFonts w:ascii="微软雅黑" w:eastAsia="微软雅黑" w:hAnsi="微软雅黑"/>
-          <w:color w:val="1F6F8B"/>
-          <w:lang w:eastAsia="zh-CN"/>
-        </w:rPr>
-        <w:t>2. 市场与行业分析</w:t>
-      </w:r>
-    </w:p>
-    <w:p>
-      <w:pPr>
-        <w:spacing w:after="140" w:line="283" w:lineRule="auto"/>
-        <w:ind w:firstLine="720"/>
-        <w:rPr>
-          <w:rFonts w:hint="eastAsia"/>
-          <w:lang w:eastAsia="zh-CN"/>
-        </w:rPr>
-      </w:pPr>
-      <w:r>
-        <w:rPr>
-          <w:lang w:eastAsia="zh-CN"/>
-        </w:rPr>
-        <w:t>中国户外运动正在从小</w:t>
-      </w:r>
-      <w:proofErr w:type="gramStart"/>
-      <w:r>
-        <w:rPr>
-          <w:lang w:eastAsia="zh-CN"/>
-        </w:rPr>
-        <w:t>众兴趣</w:t>
-      </w:r>
-      <w:proofErr w:type="gramEnd"/>
-      <w:r>
-        <w:rPr>
-          <w:lang w:eastAsia="zh-CN"/>
-        </w:rPr>
-        <w:t>进入大众生活方式。政策层面，国家体育总局等部门发布的《户外运动产业发展规划（2022-2025年）》明确提出，到 2025 年户外运动产业总规模超过 3 万亿元。参与层面，公开报道显示，截至 2025 年 4 月初，</w:t>
-      </w:r>
-      <w:r>
-        <w:rPr>
-          <w:b/>
-          <w:bCs/>
-          <w:lang w:eastAsia="zh-CN"/>
-        </w:rPr>
-        <w:t xml:space="preserve">中国户外运动参与人数已突破 4 </w:t>
-      </w:r>
-      <w:r>
-        <w:rPr>
-          <w:lang w:eastAsia="zh-CN"/>
-        </w:rPr>
-        <w:t>亿。供给层面，户外相关企业、步道、露营、冰雪、水上运动等细分场景快速增长。这说明户外不是单点工具市场，而是一个以目的地、线路、装备、交通、内容、社交和安全服务共同构成的复合型场景。</w:t>
-      </w:r>
-    </w:p>
-    <w:p>
-      <w:pPr>
-        <w:spacing w:after="140" w:line="283" w:lineRule="auto"/>
-        <w:ind w:firstLine="720"/>
-        <w:rPr>
-          <w:rFonts w:hint="eastAsia"/>
-          <w:lang w:eastAsia="zh-CN"/>
-        </w:rPr>
-      </w:pPr>
-      <w:r>
-        <w:rPr>
-          <w:lang w:eastAsia="zh-CN"/>
-        </w:rPr>
-        <w:t>美国市场可作为成熟市场参照。美国 BEA 发布的 2024 年户外休闲经济数据表明，美国户外休闲经济增加值为 6967 亿美元，占当年 GDP 的 2.4%。OIA/Outdoor Foundation 的参与趋势数据显示，美国 2024 年户外参与人数达到 1.811 亿，占 6 岁及以上人口 58.6%。中美数据口径不同，中国的 3 万亿元是产业规模目标，美国 BEA 是 GDP 增加值，因此不能直接比较绝对数值，但可以说明户外运动在成熟市场中具有稳定经济贡献和高参与渗透。</w:t>
-      </w:r>
-    </w:p>
-    <w:p>
-      <w:pPr>
-        <w:jc w:val="center"/>
-        <w:rPr>
-          <w:rFonts w:hint="eastAsia"/>
-          <w:lang w:eastAsia="zh-CN"/>
-        </w:rPr>
-      </w:pPr>
-      <w:r>
-        <w:rPr>
           <w:noProof/>
         </w:rPr>
-        <w:lastRenderedPageBreak/>
         <w:drawing>
           <wp:inline distT="0" distB="0" distL="0" distR="0" wp14:anchorId="583CEAA6" wp14:editId="3402D1CD">
             <wp:extent cx="5897880" cy="1734671"/>
@@ -551,17 +866,8 @@
           <w:rFonts w:ascii="微软雅黑" w:eastAsia="微软雅黑" w:hAnsi="微软雅黑"/>
           <w:color w:val="1F6F8B"/>
         </w:rPr>
-        <w:t xml:space="preserve">3. </w:t>
-      </w:r>
-      <w:proofErr w:type="spellStart"/>
-      <w:r>
-        <w:rPr>
-          <w:rFonts w:ascii="微软雅黑" w:eastAsia="微软雅黑" w:hAnsi="微软雅黑"/>
-          <w:color w:val="1F6F8B"/>
-        </w:rPr>
-        <w:t>竞品分析与产品启发</w:t>
-      </w:r>
-      <w:proofErr w:type="spellEnd"/>
+        <w:t>3. 竞品分析与产品启发</w:t>
+      </w:r>
     </w:p>
     <w:p>
       <w:pPr>
@@ -621,33 +927,11 @@
           <w:lang w:eastAsia="zh-CN"/>
         </w:rPr>
       </w:pPr>
-      <w:proofErr w:type="gramStart"/>
-      <w:r>
-        <w:rPr>
-          <w:lang w:eastAsia="zh-CN"/>
-        </w:rPr>
-        <w:t>竞品共同</w:t>
-      </w:r>
-      <w:proofErr w:type="gramEnd"/>
-      <w:r>
-        <w:rPr>
-          <w:lang w:eastAsia="zh-CN"/>
-        </w:rPr>
-        <w:t>说明两点。第一，成熟户外产品都有明确的数据资产对象：Trail、Route、Tour、Activity、Collection 等，而不是把所有东西放在聊天中。第二，保存和分享是户外规划天然行为：用户不是一个人完成决策，而是会把线路发给朋友、</w:t>
-      </w:r>
-      <w:proofErr w:type="gramStart"/>
-      <w:r>
-        <w:rPr>
-          <w:lang w:eastAsia="zh-CN"/>
-        </w:rPr>
-        <w:t>群聊或</w:t>
-      </w:r>
-      <w:proofErr w:type="gramEnd"/>
-      <w:r>
-        <w:rPr>
-          <w:lang w:eastAsia="zh-CN"/>
-        </w:rPr>
-        <w:t>自己保存后反复查看。</w:t>
+      <w:r>
+        <w:rPr>
+          <w:lang w:eastAsia="zh-CN"/>
+        </w:rPr>
+        <w:t>竞品共同说明两点。第一，成熟户外产品都有明确的数据资产对象：Trail、Route、Tour、Activity、Collection 等，而不是把所有东西放在聊天中。第二，保存和分享是户外规划天然行为：用户不是一个人完成决策，而是会把线路发给朋友、群聊或自己保存后反复查看。</w:t>
       </w:r>
     </w:p>
     <w:p>
@@ -663,6 +947,7 @@
         <w:rPr>
           <w:lang w:eastAsia="zh-CN"/>
         </w:rPr>
+        <w:lastRenderedPageBreak/>
         <w:t>我们的差异化不在于做另一个线路库，也不在于做另一个聊天机器人，而在于把 Agent、轨迹资产和能力画像结合：用户可以用自然语言表达“周末想看雪山但别太累”，系统不是做关键词匹配，而是把“雪山”作为体验目标，把“别太累”作为强度约束，把出发地、交通、同行者、历史爬升能力等转化为可计算上下文，再召回</w:t>
       </w:r>
       <w:r>
@@ -687,7 +972,6 @@
           <w:color w:val="1F6F8B"/>
           <w:lang w:eastAsia="zh-CN"/>
         </w:rPr>
-        <w:lastRenderedPageBreak/>
         <w:t>4. 目标用户与需求分析</w:t>
       </w:r>
     </w:p>
@@ -809,21 +1093,7 @@
         <w:rPr>
           <w:lang w:eastAsia="zh-CN"/>
         </w:rPr>
-        <w:t xml:space="preserve">需求分析的核心结论是：产品不应以工具页堆叠为中心，而应以一次 </w:t>
-      </w:r>
-      <w:proofErr w:type="spellStart"/>
-      <w:r>
-        <w:rPr>
-          <w:lang w:eastAsia="zh-CN"/>
-        </w:rPr>
-        <w:t>TripPlan</w:t>
-      </w:r>
-      <w:proofErr w:type="spellEnd"/>
-      <w:r>
-        <w:rPr>
-          <w:lang w:eastAsia="zh-CN"/>
-        </w:rPr>
-        <w:t xml:space="preserve"> 规划任务为中心。用户可以在</w:t>
+        <w:t>需求分析的核心结论是：产品不应以工具页堆叠为中心，而应以一次 TripPlan 规划任务为中心。用户可以在</w:t>
       </w:r>
       <w:r>
         <w:rPr>
@@ -839,23 +1109,13 @@
         </w:rPr>
         <w:t>，也可以多次生成</w:t>
       </w:r>
-      <w:proofErr w:type="gramStart"/>
       <w:r>
         <w:rPr>
           <w:b/>
           <w:bCs/>
           <w:lang w:eastAsia="zh-CN"/>
         </w:rPr>
-        <w:t>候选和</w:t>
-      </w:r>
-      <w:proofErr w:type="gramEnd"/>
-      <w:r>
-        <w:rPr>
-          <w:b/>
-          <w:bCs/>
-          <w:lang w:eastAsia="zh-CN"/>
-        </w:rPr>
-        <w:t>方案卡</w:t>
+        <w:t>候选和方案卡</w:t>
       </w:r>
       <w:r>
         <w:rPr>
@@ -965,49 +1225,8 @@
         <w:rPr>
           <w:lang w:eastAsia="zh-CN"/>
         </w:rPr>
-        <w:t>第一阶段明确做移动端 Web，而不是 PC Web、小程序或 App。设计上采用手机优先的底部 Tab、卡片交互、软键盘适配、</w:t>
-      </w:r>
-      <w:proofErr w:type="gramStart"/>
-      <w:r>
-        <w:rPr>
-          <w:lang w:eastAsia="zh-CN"/>
-        </w:rPr>
-        <w:t>微信内置</w:t>
-      </w:r>
-      <w:proofErr w:type="gramEnd"/>
-      <w:r>
-        <w:rPr>
-          <w:lang w:eastAsia="zh-CN"/>
-        </w:rPr>
-        <w:t xml:space="preserve">浏览器兼容。技术上仍然使用 React/Vite + </w:t>
-      </w:r>
-      <w:proofErr w:type="spellStart"/>
-      <w:r>
-        <w:rPr>
-          <w:lang w:eastAsia="zh-CN"/>
-        </w:rPr>
-        <w:t>FastAPI</w:t>
-      </w:r>
-      <w:proofErr w:type="spellEnd"/>
-      <w:r>
-        <w:rPr>
-          <w:lang w:eastAsia="zh-CN"/>
-        </w:rPr>
-        <w:t xml:space="preserve">，后端 API </w:t>
-      </w:r>
-      <w:proofErr w:type="gramStart"/>
-      <w:r>
-        <w:rPr>
-          <w:lang w:eastAsia="zh-CN"/>
-        </w:rPr>
-        <w:t>不</w:t>
-      </w:r>
-      <w:proofErr w:type="gramEnd"/>
-      <w:r>
-        <w:rPr>
-          <w:lang w:eastAsia="zh-CN"/>
-        </w:rPr>
-        <w:t>绑定 Web，以便后续接入小程序或 App。</w:t>
+        <w:lastRenderedPageBreak/>
+        <w:t>第一阶段明确做移动端 Web，而不是 PC Web、小程序或 App。设计上采用手机优先的底部 Tab、卡片交互、软键盘适配、微信内置浏览器兼容。技术上仍然使用 React/Vite + FastAPI，后端 API 不绑定 Web，以便后续接入小程序或 App。</w:t>
       </w:r>
     </w:p>
     <w:p>
@@ -1039,21 +1258,7 @@
         <w:rPr>
           <w:lang w:eastAsia="zh-CN"/>
         </w:rPr>
-        <w:t>候选线路列表采用</w:t>
-      </w:r>
-      <w:proofErr w:type="gramStart"/>
-      <w:r>
-        <w:rPr>
-          <w:lang w:eastAsia="zh-CN"/>
-        </w:rPr>
-        <w:t>极</w:t>
-      </w:r>
-      <w:proofErr w:type="gramEnd"/>
-      <w:r>
-        <w:rPr>
-          <w:lang w:eastAsia="zh-CN"/>
-        </w:rPr>
-        <w:t>简卡片，只展示线路名称、优势标签、距离、爬升。这个取舍来自移动端信息密度：列表阶段的目标是让用户快速形成兴趣和比较，而不是一次性读完所有解释。预算、交通、风险、证据、适合原因全部下沉到详情。</w:t>
+        <w:t>候选线路列表采用极简卡片，只展示线路名称、优势标签、距离、爬升。这个取舍来自移动端信息密度：列表阶段的目标是让用户快速形成兴趣和比较，而不是一次性读完所有解释。预算、交通、风险、证据、适合原因全部下沉到详情。</w:t>
       </w:r>
     </w:p>
     <w:p>
@@ -1069,22 +1274,7 @@
         <w:rPr>
           <w:lang w:eastAsia="zh-CN"/>
         </w:rPr>
-        <w:lastRenderedPageBreak/>
-        <w:t>详情卡片是核心交付物。它展示距离、爬升、预计用时、难度、适合原因、主要风险、交通可达性、轻</w:t>
-      </w:r>
-      <w:proofErr w:type="gramStart"/>
-      <w:r>
-        <w:rPr>
-          <w:lang w:eastAsia="zh-CN"/>
-        </w:rPr>
-        <w:t>量预算</w:t>
-      </w:r>
-      <w:proofErr w:type="gramEnd"/>
-      <w:r>
-        <w:rPr>
-          <w:lang w:eastAsia="zh-CN"/>
-        </w:rPr>
-        <w:t>区间、自然语言可行性判断、证据摘要和查看依据浮层。证据浮层支持移动端点按展开，不依赖桌面</w:t>
+        <w:t>详情卡片是核心交付物。它展示距离、爬升、预计用时、难度、适合原因、主要风险、交通可达性、轻量预算区间、自然语言可行性判断、证据摘要和查看依据浮层。证据浮层支持移动端点按展开，不依赖桌面</w:t>
       </w:r>
       <w:r>
         <w:rPr>
@@ -1113,21 +1303,7 @@
         <w:rPr>
           <w:lang w:eastAsia="zh-CN"/>
         </w:rPr>
-        <w:t xml:space="preserve">我们放弃显式的“选择-确认-生成攻略”主流程。原因是用户拿到有用结果后可能直接放下手机、截图、发给朋友、复制文本或稍后再回来看。这些行为本身就是价值体现。强迫用户确认选择会把 Agent 产品做成僵硬表单。保存到我的规划是一种隐式选择，但不改变 </w:t>
-      </w:r>
-      <w:proofErr w:type="spellStart"/>
-      <w:r>
-        <w:rPr>
-          <w:lang w:eastAsia="zh-CN"/>
-        </w:rPr>
-        <w:t>TripPlan</w:t>
-      </w:r>
-      <w:proofErr w:type="spellEnd"/>
-      <w:r>
-        <w:rPr>
-          <w:lang w:eastAsia="zh-CN"/>
-        </w:rPr>
-        <w:t xml:space="preserve"> 主状态。</w:t>
+        <w:t>我们放弃显式的“选择-确认-生成攻略”主流程。原因是用户拿到有用结果后可能直接放下手机、截图、发给朋友、复制文本或稍后再回来看。这些行为本身就是价值体现。强迫用户确认选择会把 Agent 产品做成僵硬表单。保存到我的规划是一种隐式选择，但不改变 TripPlan 主状态。</w:t>
       </w:r>
     </w:p>
     <w:p>
@@ -1194,6 +1370,7 @@
           <w:rFonts w:ascii="微软雅黑" w:eastAsia="微软雅黑" w:hAnsi="微软雅黑"/>
           <w:color w:val="1F6F8B"/>
         </w:rPr>
+        <w:lastRenderedPageBreak/>
         <w:t>7. 核心数据资产</w:t>
       </w:r>
     </w:p>
@@ -1322,7 +1499,6 @@
           <w:color w:val="1F6F8B"/>
           <w:lang w:eastAsia="zh-CN"/>
         </w:rPr>
-        <w:lastRenderedPageBreak/>
         <w:t>8. AI Agent 架构设计</w:t>
       </w:r>
     </w:p>
@@ -1365,7 +1541,6 @@
         </w:rPr>
         <w:t>任务状态图和</w:t>
       </w:r>
-      <w:proofErr w:type="gramStart"/>
       <w:r>
         <w:rPr>
           <w:rFonts w:hint="eastAsia"/>
@@ -1373,27 +1548,17 @@
           <w:bCs/>
           <w:lang w:eastAsia="zh-CN"/>
         </w:rPr>
-        <w:t>图工作</w:t>
-      </w:r>
-      <w:proofErr w:type="gramEnd"/>
+        <w:t>图工作流</w:t>
+      </w:r>
+      <w:r>
+        <w:rPr>
+          <w:lang w:eastAsia="zh-CN"/>
+        </w:rPr>
+        <w:t>，内层按节点选择不同 Agent 范式。这个设计</w:t>
+      </w:r>
       <w:r>
         <w:rPr>
           <w:rFonts w:hint="eastAsia"/>
-          <w:b/>
-          <w:bCs/>
-          <w:lang w:eastAsia="zh-CN"/>
-        </w:rPr>
-        <w:t>流</w:t>
-      </w:r>
-      <w:r>
-        <w:rPr>
-          <w:lang w:eastAsia="zh-CN"/>
-        </w:rPr>
-        <w:t>，内层按节点选择不同 Agent 范式。这个设计</w:t>
-      </w:r>
-      <w:r>
-        <w:rPr>
-          <w:rFonts w:hint="eastAsia"/>
           <w:lang w:eastAsia="zh-CN"/>
         </w:rPr>
         <w:t>符合</w:t>
@@ -1402,35 +1567,7 @@
         <w:rPr>
           <w:lang w:eastAsia="zh-CN"/>
         </w:rPr>
-        <w:t xml:space="preserve">能确定的流程用代码编排，不确定的探索才使用 Agent 自主决策的原则，避免纯 </w:t>
-      </w:r>
-      <w:proofErr w:type="spellStart"/>
-      <w:r>
-        <w:rPr>
-          <w:lang w:eastAsia="zh-CN"/>
-        </w:rPr>
-        <w:t>ReAct</w:t>
-      </w:r>
-      <w:proofErr w:type="spellEnd"/>
-      <w:r>
-        <w:rPr>
-          <w:lang w:eastAsia="zh-CN"/>
-        </w:rPr>
-        <w:t xml:space="preserve"> 带来的不可</w:t>
-      </w:r>
-      <w:proofErr w:type="gramStart"/>
-      <w:r>
-        <w:rPr>
-          <w:lang w:eastAsia="zh-CN"/>
-        </w:rPr>
-        <w:t>控成本</w:t>
-      </w:r>
-      <w:proofErr w:type="gramEnd"/>
-      <w:r>
-        <w:rPr>
-          <w:lang w:eastAsia="zh-CN"/>
-        </w:rPr>
-        <w:t>和输出漂移。</w:t>
+        <w:t>能确定的流程用代码编排，不确定的探索才使用 Agent 自主决策的原则，避免纯 ReAct 带来的不可控成本和输出漂移。</w:t>
       </w:r>
     </w:p>
     <w:p>
@@ -1491,21 +1628,9 @@
           <w:lang w:eastAsia="zh-CN"/>
         </w:rPr>
       </w:pPr>
-      <w:proofErr w:type="spellStart"/>
-      <w:r>
-        <w:t>AgentRun.run_status</w:t>
-      </w:r>
-      <w:proofErr w:type="spellEnd"/>
-      <w:r>
-        <w:t xml:space="preserve"> </w:t>
-      </w:r>
-      <w:proofErr w:type="spellStart"/>
-      <w:r>
-        <w:t>采用</w:t>
-      </w:r>
-      <w:proofErr w:type="spellEnd"/>
-      <w:r>
-        <w:t xml:space="preserve"> queued、running、waiting_user、succeeded、partial、failed、cancelled。</w:t>
+      <w:r>
+        <w:lastRenderedPageBreak/>
+        <w:t>AgentRun.run_status 采用 queued、running、waiting_user、succeeded、partial、failed、cancelled。</w:t>
       </w:r>
       <w:r>
         <w:rPr>
@@ -1549,19 +1674,11 @@
           <w:lang w:eastAsia="zh-CN"/>
         </w:rPr>
       </w:pPr>
-      <w:proofErr w:type="spellStart"/>
-      <w:r>
-        <w:rPr>
-          <w:lang w:eastAsia="zh-CN"/>
-        </w:rPr>
-        <w:t>TripPlan.status</w:t>
-      </w:r>
-      <w:proofErr w:type="spellEnd"/>
-      <w:r>
-        <w:rPr>
-          <w:lang w:eastAsia="zh-CN"/>
-        </w:rPr>
-        <w:t xml:space="preserve"> 则保持三态：draft、active、closed。它只描述规划任务是否形成、是否活跃、是否关闭。候选是否存在、方案是否保存、分享是否发生、Agent 是否失败，都不</w:t>
+      <w:r>
+        <w:rPr>
+          <w:lang w:eastAsia="zh-CN"/>
+        </w:rPr>
+        <w:t>TripPlan.status 则保持三态：draft、active、closed。它只描述规划任务是否形成、是否活跃、是否关闭。候选是否存在、方案是否保存、分享是否发生、Agent 是否失败，都不</w:t>
       </w:r>
       <w:r>
         <w:rPr>
@@ -1570,19 +1687,11 @@
         </w:rPr>
         <w:t>干扰</w:t>
       </w:r>
-      <w:proofErr w:type="spellStart"/>
-      <w:r>
-        <w:rPr>
-          <w:lang w:eastAsia="zh-CN"/>
-        </w:rPr>
-        <w:t>TripPlan</w:t>
-      </w:r>
-      <w:proofErr w:type="spellEnd"/>
-      <w:r>
-        <w:rPr>
-          <w:lang w:eastAsia="zh-CN"/>
-        </w:rPr>
-        <w:t xml:space="preserve"> 主状态。</w:t>
+      <w:r>
+        <w:rPr>
+          <w:lang w:eastAsia="zh-CN"/>
+        </w:rPr>
+        <w:t>TripPlan 主状态。</w:t>
       </w:r>
     </w:p>
     <w:p>
@@ -1614,105 +1723,7 @@
         <w:rPr>
           <w:lang w:eastAsia="zh-CN"/>
         </w:rPr>
-        <w:t xml:space="preserve">推荐 PostgreSQL + </w:t>
-      </w:r>
-      <w:proofErr w:type="spellStart"/>
-      <w:r>
-        <w:rPr>
-          <w:lang w:eastAsia="zh-CN"/>
-        </w:rPr>
-        <w:t>PostGIS</w:t>
-      </w:r>
-      <w:proofErr w:type="spellEnd"/>
-      <w:r>
-        <w:rPr>
-          <w:lang w:eastAsia="zh-CN"/>
-        </w:rPr>
-        <w:t xml:space="preserve"> + </w:t>
-      </w:r>
-      <w:proofErr w:type="spellStart"/>
-      <w:r>
-        <w:rPr>
-          <w:lang w:eastAsia="zh-CN"/>
-        </w:rPr>
-        <w:t>pgvector</w:t>
-      </w:r>
-      <w:proofErr w:type="spellEnd"/>
-      <w:r>
-        <w:rPr>
-          <w:lang w:eastAsia="zh-CN"/>
-        </w:rPr>
-        <w:t>。选择 PostgreSQL 不是否定 MySQL，而是因为本产品的核心数据天然包含空间、轨迹、JSON 状态和向量检索。</w:t>
-      </w:r>
-      <w:proofErr w:type="spellStart"/>
-      <w:r>
-        <w:rPr>
-          <w:lang w:eastAsia="zh-CN"/>
-        </w:rPr>
-        <w:t>PostGIS</w:t>
-      </w:r>
-      <w:proofErr w:type="spellEnd"/>
-      <w:r>
-        <w:rPr>
-          <w:lang w:eastAsia="zh-CN"/>
-        </w:rPr>
-        <w:t xml:space="preserve"> 提供成熟空间数据类型和空间索引，</w:t>
-      </w:r>
-      <w:proofErr w:type="spellStart"/>
-      <w:r>
-        <w:rPr>
-          <w:lang w:eastAsia="zh-CN"/>
-        </w:rPr>
-        <w:t>pgvector</w:t>
-      </w:r>
-      <w:proofErr w:type="spellEnd"/>
-      <w:r>
-        <w:rPr>
-          <w:lang w:eastAsia="zh-CN"/>
-        </w:rPr>
-        <w:t xml:space="preserve"> 允许在同一个数据库中保存向量并执行近邻检索，JSONB 适合保存 </w:t>
-      </w:r>
-      <w:proofErr w:type="spellStart"/>
-      <w:r>
-        <w:rPr>
-          <w:lang w:eastAsia="zh-CN"/>
-        </w:rPr>
-        <w:t>TripPlan.state</w:t>
-      </w:r>
-      <w:proofErr w:type="spellEnd"/>
-      <w:r>
-        <w:rPr>
-          <w:lang w:eastAsia="zh-CN"/>
-        </w:rPr>
-        <w:t xml:space="preserve"> 这</w:t>
-      </w:r>
-      <w:proofErr w:type="gramStart"/>
-      <w:r>
-        <w:rPr>
-          <w:lang w:eastAsia="zh-CN"/>
-        </w:rPr>
-        <w:t>类结构化但会</w:t>
-      </w:r>
-      <w:proofErr w:type="gramEnd"/>
-      <w:r>
-        <w:rPr>
-          <w:lang w:eastAsia="zh-CN"/>
-        </w:rPr>
-        <w:t>演化的上下文。MVP 阶段</w:t>
-      </w:r>
-      <w:proofErr w:type="gramStart"/>
-      <w:r>
-        <w:rPr>
-          <w:lang w:eastAsia="zh-CN"/>
-        </w:rPr>
-        <w:t>单库能</w:t>
-      </w:r>
-      <w:proofErr w:type="gramEnd"/>
-      <w:r>
-        <w:rPr>
-          <w:lang w:eastAsia="zh-CN"/>
-        </w:rPr>
-        <w:t>降低系统复杂度，避免过早引入独立向量数据库和多服务一致性问题。</w:t>
+        <w:t>推荐 PostgreSQL + PostGIS + pgvector。选择 PostgreSQL 不是否定 MySQL，而是因为本产品的核心数据天然包含空间、轨迹、JSON 状态和向量检索。PostGIS 提供成熟空间数据类型和空间索引，pgvector 允许在同一个数据库中保存向量并执行近邻检索，JSONB 适合保存 TripPlan.state 这类结构化但会演化的上下文。MVP 阶段单库能降低系统复杂度，避免过早引入独立向量数据库和多服务一致性问题。</w:t>
       </w:r>
     </w:p>
     <w:p>
@@ -1743,7 +1754,6 @@
         <w:rPr>
           <w:noProof/>
         </w:rPr>
-        <w:lastRenderedPageBreak/>
         <w:drawing>
           <wp:inline distT="0" distB="0" distL="0" distR="0" wp14:anchorId="2859B0AA" wp14:editId="13DB3118">
             <wp:extent cx="5897880" cy="1526510"/>
@@ -1789,37 +1799,8 @@
           <w:rFonts w:hint="eastAsia"/>
         </w:rPr>
       </w:pPr>
-      <w:proofErr w:type="spellStart"/>
-      <w:r>
-        <w:t>TrackParser</w:t>
-      </w:r>
-      <w:proofErr w:type="spellEnd"/>
-      <w:r>
-        <w:t xml:space="preserve"> 和 </w:t>
-      </w:r>
-      <w:proofErr w:type="spellStart"/>
-      <w:r>
-        <w:t>RouteAnalyzer</w:t>
-      </w:r>
-      <w:proofErr w:type="spellEnd"/>
-      <w:r>
-        <w:t xml:space="preserve"> </w:t>
-      </w:r>
-      <w:proofErr w:type="spellStart"/>
-      <w:r>
-        <w:t>不应在推荐阶段实时运行。导入线路时由</w:t>
-      </w:r>
-      <w:proofErr w:type="spellEnd"/>
-      <w:r>
-        <w:t xml:space="preserve"> RouteAsset Service </w:t>
-      </w:r>
-      <w:proofErr w:type="spellStart"/>
-      <w:r>
-        <w:t>编排解析和分析，产出</w:t>
-      </w:r>
-      <w:proofErr w:type="spellEnd"/>
-      <w:r>
-        <w:t xml:space="preserve"> RouteAnalysisSnapshot 与索引；推荐阶段只读取 RouteRepository 和 VectorIndex。这样可以保证推荐快速、可缓存、可测试。</w:t>
+      <w:r>
+        <w:t>TrackParser 和 RouteAnalyzer 不应在推荐阶段实时运行。导入线路时由 RouteAsset Service 编排解析和分析，产出 RouteAnalysisSnapshot 与索引；推荐阶段只读取 RouteRepository 和 VectorIndex。这样可以保证推荐快速、可缓存、可测试。</w:t>
       </w:r>
     </w:p>
     <w:p>
@@ -1835,6 +1816,7 @@
           <w:color w:val="1F6F8B"/>
           <w:lang w:eastAsia="zh-CN"/>
         </w:rPr>
+        <w:lastRenderedPageBreak/>
         <w:t>10. MVP 边界、指标与迭代路线</w:t>
       </w:r>
     </w:p>
@@ -1916,21 +1898,7 @@
         <w:rPr>
           <w:lang w:eastAsia="zh-CN"/>
         </w:rPr>
-        <w:t>迭代路线建议分三阶段。第一阶段完成 Mobile H5 Demo，验证路线推荐和方案卡；第二阶段接</w:t>
-      </w:r>
-      <w:proofErr w:type="gramStart"/>
-      <w:r>
-        <w:rPr>
-          <w:lang w:eastAsia="zh-CN"/>
-        </w:rPr>
-        <w:t>入微信</w:t>
-      </w:r>
-      <w:proofErr w:type="gramEnd"/>
-      <w:r>
-        <w:rPr>
-          <w:lang w:eastAsia="zh-CN"/>
-        </w:rPr>
-        <w:t>小程序或加强移动端分享，验证社交传播；第三阶段在产品价值成立后再考虑 App、离线地图、行中导航、轨迹记录、设备同步和 UGC 社区。</w:t>
+        <w:t>迭代路线建议分三阶段。第一阶段完成 Mobile H5 Demo，验证路线推荐和方案卡；第二阶段接入微信小程序或加强移动端分享，验证社交传播；第三阶段在产品价值成立后再考虑 App、离线地图、行中导航、轨迹记录、设备同步和 UGC 社区。</w:t>
       </w:r>
     </w:p>
     <w:p>
@@ -1978,36 +1946,7 @@
         <w:rPr>
           <w:lang w:eastAsia="zh-CN"/>
         </w:rPr>
-        <w:lastRenderedPageBreak/>
-        <w:t xml:space="preserve">关于“为什么详情方案就是核心交付”：户外规划的决策不是电商下单式的线性流程。用户看到一条线路后，可能立刻把它发给朋友，可能截图保存，可能放下手机去准备，也可能继续追问交通或天气。如果系统要求用户先选择、再确认、再生成攻略，反而会打断真实决策节奏。因此本产品把 </w:t>
-      </w:r>
-      <w:proofErr w:type="spellStart"/>
-      <w:r>
-        <w:rPr>
-          <w:lang w:eastAsia="zh-CN"/>
-        </w:rPr>
-        <w:t>RoutePlanSnapshot</w:t>
-      </w:r>
-      <w:proofErr w:type="spellEnd"/>
-      <w:r>
-        <w:rPr>
-          <w:lang w:eastAsia="zh-CN"/>
-        </w:rPr>
-        <w:t xml:space="preserve"> 定义为“从规划中沉淀的小卡片”，它可以保存和分享，但不强制成为最终计划。这个设计承认用户决策的非线性，也符合我们把 </w:t>
-      </w:r>
-      <w:proofErr w:type="spellStart"/>
-      <w:r>
-        <w:rPr>
-          <w:lang w:eastAsia="zh-CN"/>
-        </w:rPr>
-        <w:t>TripPlan</w:t>
-      </w:r>
-      <w:proofErr w:type="spellEnd"/>
-      <w:r>
-        <w:rPr>
-          <w:lang w:eastAsia="zh-CN"/>
-        </w:rPr>
-        <w:t xml:space="preserve"> 视为持续工作区的架构。</w:t>
+        <w:t>关于“为什么详情方案就是核心交付”：户外规划的决策不是电商下单式的线性流程。用户看到一条线路后，可能立刻把它发给朋友，可能截图保存，可能放下手机去准备，也可能继续追问交通或天气。如果系统要求用户先选择、再确认、再生成攻略，反而会打断真实决策节奏。因此本产品把 RoutePlanSnapshot 定义为“从规划中沉淀的小卡片”，它可以保存和分享，但不强制成为最终计划。这个设计承认用户决策的非线性，也符合我们把 TripPlan 视为持续工作区的架构。</w:t>
       </w:r>
     </w:p>
     <w:p>
@@ -2039,35 +1978,8 @@
         <w:rPr>
           <w:lang w:eastAsia="zh-CN"/>
         </w:rPr>
-        <w:t xml:space="preserve">关于“为什么能力画像只表达能力”：用户的历史完成轨迹可以证明他大概走过多远、爬过多高、近期活动频率如何，但不能直接证明他喜欢什么。把能力和偏好混在一起，会导致推荐逻辑污染。例如用户上传一条别人分享的高强度 KML，并不代表他有能力完成；用户这次说想轻松一点，也不代表长期能力下降。因此 </w:t>
-      </w:r>
-      <w:proofErr w:type="spellStart"/>
-      <w:r>
-        <w:rPr>
-          <w:lang w:eastAsia="zh-CN"/>
-        </w:rPr>
-        <w:t>ActivityTrack</w:t>
-      </w:r>
-      <w:proofErr w:type="spellEnd"/>
-      <w:r>
-        <w:rPr>
-          <w:lang w:eastAsia="zh-CN"/>
-        </w:rPr>
-        <w:t xml:space="preserve"> 只用于 </w:t>
-      </w:r>
-      <w:proofErr w:type="spellStart"/>
-      <w:r>
-        <w:rPr>
-          <w:lang w:eastAsia="zh-CN"/>
-        </w:rPr>
-        <w:t>UserAbilityProfile</w:t>
-      </w:r>
-      <w:proofErr w:type="spellEnd"/>
-      <w:r>
-        <w:rPr>
-          <w:lang w:eastAsia="zh-CN"/>
-        </w:rPr>
-        <w:t>，</w:t>
+        <w:lastRenderedPageBreak/>
+        <w:t>关于“为什么能力画像只表达能力”：用户的历史完成轨迹可以证明他大概走过多远、爬过多高、近期活动频率如何，但不能直接证明他喜欢什么。把能力和偏好混在一起，会导致推荐逻辑污染。例如用户上传一条别人分享的高强度 KML，并不代表他有能力完成；用户这次说想轻松一点，也不代表长期能力下降。因此 ActivityTrack 只用于 UserAbilityProfile，</w:t>
       </w:r>
       <w:r>
         <w:rPr>
@@ -2111,21 +2023,7 @@
         <w:rPr>
           <w:lang w:eastAsia="zh-CN"/>
         </w:rPr>
-        <w:t xml:space="preserve">关于“为什么外部搜索只做候选验证”：外部搜索成本高、延迟高、结果不稳定，不应承担全库初筛。MVP 的主检索应基于系统线路库和解析后的轨迹指标，先召回一批候选，再对高潜候选做交通、天气和近期路况验证。这样既能保证推荐速度，又能把外部证据用在最需要的地方。Bounded </w:t>
-      </w:r>
-      <w:proofErr w:type="spellStart"/>
-      <w:r>
-        <w:rPr>
-          <w:lang w:eastAsia="zh-CN"/>
-        </w:rPr>
-        <w:t>ReAct</w:t>
-      </w:r>
-      <w:proofErr w:type="spellEnd"/>
-      <w:r>
-        <w:rPr>
-          <w:lang w:eastAsia="zh-CN"/>
-        </w:rPr>
-        <w:t xml:space="preserve"> 适合解决开放探索问题，例如近期是否有人走过、是否有封路或积雪风险，但它不应成为整个推荐系统的主干</w:t>
+        <w:t>关于“为什么外部搜索只做候选验证”：外部搜索成本高、延迟高、结果不稳定，不应承担全库初筛。MVP 的主检索应基于系统线路库和解析后的轨迹指标，先召回一批候选，再对高潜候选做交通、天气和近期路况验证。这样既能保证推荐速度，又能把外部证据用在最需要的地方。Bounded ReAct 适合解决开放探索问题，例如近期是否有人走过、是否有封路或积雪风险，但它不应成为整个推荐系统的主干</w:t>
       </w:r>
     </w:p>
     <w:p>
@@ -2141,49 +2039,7 @@
         <w:rPr>
           <w:lang w:eastAsia="zh-CN"/>
         </w:rPr>
-        <w:t xml:space="preserve">关于“为什么 PostgreSQL 优先”：团队熟悉 MySQL 是现实约束，但本产品未来一定会处理空间、轨迹、向量、JSON 状态和复杂查询。PostgreSQL 可以用 </w:t>
-      </w:r>
-      <w:proofErr w:type="spellStart"/>
-      <w:r>
-        <w:rPr>
-          <w:lang w:eastAsia="zh-CN"/>
-        </w:rPr>
-        <w:t>PostGIS</w:t>
-      </w:r>
-      <w:proofErr w:type="spellEnd"/>
-      <w:r>
-        <w:rPr>
-          <w:lang w:eastAsia="zh-CN"/>
-        </w:rPr>
-        <w:t xml:space="preserve"> 处理空间数据，用 </w:t>
-      </w:r>
-      <w:proofErr w:type="spellStart"/>
-      <w:r>
-        <w:rPr>
-          <w:lang w:eastAsia="zh-CN"/>
-        </w:rPr>
-        <w:t>pgvector</w:t>
-      </w:r>
-      <w:proofErr w:type="spellEnd"/>
-      <w:r>
-        <w:rPr>
-          <w:lang w:eastAsia="zh-CN"/>
-        </w:rPr>
-        <w:t xml:space="preserve"> 存储和检索向量，用 JSONB 保存演化中的 </w:t>
-      </w:r>
-      <w:proofErr w:type="spellStart"/>
-      <w:r>
-        <w:rPr>
-          <w:lang w:eastAsia="zh-CN"/>
-        </w:rPr>
-        <w:t>TripPlan.state</w:t>
-      </w:r>
-      <w:proofErr w:type="spellEnd"/>
-      <w:r>
-        <w:rPr>
-          <w:lang w:eastAsia="zh-CN"/>
-        </w:rPr>
-        <w:t>，并且保持事务一致性。MVP 阶段用一个数据库承载业务、空间和向量能力，比同时维护关系库、向量库和空间服务更简单、更稳定。MySQL 仍然可以做传统业务系统，但在本产品的轨迹和检索场景下不是最优选。</w:t>
+        <w:t>关于“为什么 PostgreSQL 优先”：团队熟悉 MySQL 是现实约束，但本产品未来一定会处理空间、轨迹、向量、JSON 状态和复杂查询。PostgreSQL 可以用 PostGIS 处理空间数据，用 pgvector 存储和检索向量，用 JSONB 保存演化中的 TripPlan.state，并且保持事务一致性。MVP 阶段用一个数据库承载业务、空间和向量能力，比同时维护关系库、向量库和空间服务更简单、更稳定。MySQL 仍然可以做传统业务系统，但在本产品的轨迹和检索场景下不是最优选。</w:t>
       </w:r>
     </w:p>
     <w:p>
@@ -2199,35 +2055,7 @@
         <w:rPr>
           <w:lang w:eastAsia="zh-CN"/>
         </w:rPr>
-        <w:t>关于“为什么第一阶段不是小程序或 App”：</w:t>
-      </w:r>
-      <w:proofErr w:type="gramStart"/>
-      <w:r>
-        <w:rPr>
-          <w:lang w:eastAsia="zh-CN"/>
-        </w:rPr>
-        <w:t>微信小</w:t>
-      </w:r>
-      <w:proofErr w:type="gramEnd"/>
-      <w:r>
-        <w:rPr>
-          <w:lang w:eastAsia="zh-CN"/>
-        </w:rPr>
-        <w:t>程序适合真实分发和分享，原生 App 适合离线地图、后台定位、行中导航和设备深度联动。但在产品假设尚未验证前，这些平台会增加备案、审核、权限、地图适配和上架成本。移动端 Web 可以更快验证核心闭环，同时后端保持多端兼容。只要 API、身份、文件上传、规划状态和线路资产</w:t>
-      </w:r>
-      <w:proofErr w:type="gramStart"/>
-      <w:r>
-        <w:rPr>
-          <w:lang w:eastAsia="zh-CN"/>
-        </w:rPr>
-        <w:t>不</w:t>
-      </w:r>
-      <w:proofErr w:type="gramEnd"/>
-      <w:r>
-        <w:rPr>
-          <w:lang w:eastAsia="zh-CN"/>
-        </w:rPr>
-        <w:t>绑定 Web，后续接小程序和 App 就不会推倒重来。</w:t>
+        <w:t>关于“为什么第一阶段不是小程序或 App”：微信小程序适合真实分发和分享，原生 App 适合离线地图、后台定位、行中导航和设备深度联动。但在产品假设尚未验证前，这些平台会增加备案、审核、权限、地图适配和上架成本。移动端 Web 可以更快验证核心闭环，同时后端保持多端兼容。只要 API、身份、文件上传、规划状态和线路资产不绑定 Web，后续接小程序和 App 就不会推倒重来。</w:t>
       </w:r>
     </w:p>
     <w:p>
@@ -2243,64 +2071,7 @@
         <w:rPr>
           <w:lang w:eastAsia="zh-CN"/>
         </w:rPr>
-        <w:lastRenderedPageBreak/>
-        <w:t xml:space="preserve">关于“为什么组件边界要克制”：MVP </w:t>
-      </w:r>
-      <w:proofErr w:type="gramStart"/>
-      <w:r>
-        <w:rPr>
-          <w:lang w:eastAsia="zh-CN"/>
-        </w:rPr>
-        <w:t>不应拆微服务</w:t>
-      </w:r>
-      <w:proofErr w:type="gramEnd"/>
-      <w:r>
-        <w:rPr>
-          <w:lang w:eastAsia="zh-CN"/>
-        </w:rPr>
-        <w:t xml:space="preserve">。当前最大的风险不是服务扩容，而是产品价值是否成立、线路资产是否足够、Agent 推荐是否真的有用。后端可以是一个 </w:t>
-      </w:r>
-      <w:proofErr w:type="spellStart"/>
-      <w:r>
-        <w:rPr>
-          <w:lang w:eastAsia="zh-CN"/>
-        </w:rPr>
-        <w:t>FastAPI</w:t>
-      </w:r>
-      <w:proofErr w:type="spellEnd"/>
-      <w:r>
-        <w:rPr>
-          <w:lang w:eastAsia="zh-CN"/>
-        </w:rPr>
-        <w:t xml:space="preserve"> 应用，但内部必须保持清晰模块边界：</w:t>
-      </w:r>
-      <w:proofErr w:type="spellStart"/>
-      <w:r>
-        <w:rPr>
-          <w:lang w:eastAsia="zh-CN"/>
-        </w:rPr>
-        <w:t>TripPlan</w:t>
-      </w:r>
-      <w:proofErr w:type="spellEnd"/>
-      <w:r>
-        <w:rPr>
-          <w:lang w:eastAsia="zh-CN"/>
-        </w:rPr>
-        <w:t xml:space="preserve"> 管规划工作区，Route Domain 管线路资产和轨迹解析，User Domain 管完成活动和能力画像，Agent Orchestration 管流程编排，Evidence Tools 管外部验证。这样既能快速落地，也能避免把所有逻辑塞进 </w:t>
-      </w:r>
-      <w:proofErr w:type="spellStart"/>
-      <w:r>
-        <w:rPr>
-          <w:lang w:eastAsia="zh-CN"/>
-        </w:rPr>
-        <w:t>chat_service</w:t>
-      </w:r>
-      <w:proofErr w:type="spellEnd"/>
-      <w:r>
-        <w:rPr>
-          <w:lang w:eastAsia="zh-CN"/>
-        </w:rPr>
-        <w:t>。</w:t>
+        <w:t>关于“为什么组件边界要克制”：MVP 不应拆微服务。当前最大的风险不是服务扩容，而是产品价值是否成立、线路资产是否足够、Agent 推荐是否真的有用。后端可以是一个 FastAPI 应用，但内部必须保持清晰模块边界：TripPlan 管规划工作区，Route Domain 管线路资产和轨迹解析，User Domain 管完成活动和能力画像，Agent Orchestration 管流程编排，Evidence Tools 管外部验证。这样既能快速落地，也能避免把所有逻辑塞进 chat_service。</w:t>
       </w:r>
     </w:p>
     <w:p>
@@ -2316,7 +2087,14 @@
         <w:rPr>
           <w:lang w:eastAsia="zh-CN"/>
         </w:rPr>
-        <w:t>关于“为什么要保留 closed 状态”：closed 不是用户看到的“聊天归档”，而是系统内部对任务生命周期的判断。一个规划可能已经过期、用户长期未操作、或者用户已经保存了方案卡并暂时不再推进，此时它不应继续出现在进行中规划里，也不应主动触发 Agent 更新天气和候选。但 closed 任务仍然可以回看，也可以被用户重新打开。这个状态能让系统区分“历史可查”和“正在推进”，避免把所有对话永久堆在一个活跃列表中。</w:t>
+        <w:t>关于“为什么要保留 closed 状态”：closed 不是用户看到的“聊天归档”，而是系统内部对任务生命周期的判断。一个规划可能已经过期、用户长期未操作、或者用户已经保存了方案卡并暂时不再推进，此时它不应继续出现在进行中规划里，也不应主动触发 Agent 更新天气和候选。但 closed 任务仍然可以回看，也可</w:t>
+      </w:r>
+      <w:r>
+        <w:rPr>
+          <w:lang w:eastAsia="zh-CN"/>
+        </w:rPr>
+        <w:lastRenderedPageBreak/>
+        <w:t>以被用户重新打开。这个状态能让系统区分“历史可查”和“正在推进”，避免把所有对话永久堆在一个活跃列表中。</w:t>
       </w:r>
     </w:p>
     <w:p>
@@ -2332,49 +2110,7 @@
         <w:rPr>
           <w:lang w:eastAsia="zh-CN"/>
         </w:rPr>
-        <w:t>关于“为什么方案卡</w:t>
-      </w:r>
-      <w:proofErr w:type="gramStart"/>
-      <w:r>
-        <w:rPr>
-          <w:lang w:eastAsia="zh-CN"/>
-        </w:rPr>
-        <w:t>不</w:t>
-      </w:r>
-      <w:proofErr w:type="gramEnd"/>
-      <w:r>
-        <w:rPr>
-          <w:lang w:eastAsia="zh-CN"/>
-        </w:rPr>
-        <w:t xml:space="preserve">承载追问”：方案卡是某一时刻的结果，不是新的会话入口。如果用户对方案继续追问，系统应该回到所属 </w:t>
-      </w:r>
-      <w:proofErr w:type="spellStart"/>
-      <w:r>
-        <w:rPr>
-          <w:lang w:eastAsia="zh-CN"/>
-        </w:rPr>
-        <w:t>TripPlan</w:t>
-      </w:r>
-      <w:proofErr w:type="spellEnd"/>
-      <w:r>
-        <w:rPr>
-          <w:lang w:eastAsia="zh-CN"/>
-        </w:rPr>
-        <w:t xml:space="preserve">，把新信息加入规划上下文，再生成新的候选或新的方案卡。这样可以保证上下文只有一个主容器，避免每张卡片各自携带分叉记忆，导致状态不可解释。对用户来说，他看到的是“基于这个规划继续问”；对工程来说，所有新增事实都写回 </w:t>
-      </w:r>
-      <w:proofErr w:type="spellStart"/>
-      <w:r>
-        <w:rPr>
-          <w:lang w:eastAsia="zh-CN"/>
-        </w:rPr>
-        <w:t>TripPlan.state</w:t>
-      </w:r>
-      <w:proofErr w:type="spellEnd"/>
-      <w:r>
-        <w:rPr>
-          <w:lang w:eastAsia="zh-CN"/>
-        </w:rPr>
-        <w:t>。</w:t>
+        <w:t>关于“为什么方案卡不承载追问”：方案卡是某一时刻的结果，不是新的会话入口。如果用户对方案继续追问，系统应该回到所属 TripPlan，把新信息加入规划上下文，再生成新的候选或新的方案卡。这样可以保证上下文只有一个主容器，避免每张卡片各自携带分叉记忆，导致状态不可解释。对用户来说，他看到的是“基于这个规划继续问”；对工程来说，所有新增事实都写回 TripPlan.state。</w:t>
       </w:r>
     </w:p>
     <w:p>
@@ -2390,21 +2126,7 @@
         <w:rPr>
           <w:lang w:eastAsia="zh-CN"/>
         </w:rPr>
-        <w:t>关于“为什么要把引用证据做成浮层”：户外推荐需要可信度，但移动端详情</w:t>
-      </w:r>
-      <w:proofErr w:type="gramStart"/>
-      <w:r>
-        <w:rPr>
-          <w:lang w:eastAsia="zh-CN"/>
-        </w:rPr>
-        <w:t>页不能</w:t>
-      </w:r>
-      <w:proofErr w:type="gramEnd"/>
-      <w:r>
-        <w:rPr>
-          <w:lang w:eastAsia="zh-CN"/>
-        </w:rPr>
-        <w:t>堆满链接和长段引用。证据浮层提供了一种折中：默认只显示简短依据摘要，用户需要时可以展开查看轨迹解析、交通验证、天气季节判断、外部搜索和能力画像匹配。这个设计既保护主阅读路径，也让产品区别于泛泛而谈的 AI 文案。</w:t>
+        <w:t>关于“为什么要把引用证据做成浮层”：户外推荐需要可信度，但移动端详情页不能堆满链接和长段引用。证据浮层提供了一种折中：默认只显示简短依据摘要，用户需要时可以展开查看轨迹解析、交通验证、天气季节判断、外部搜索和能力画像匹配。这个设计既保护主阅读路径，也让产品区别于泛泛而谈的 AI 文案。</w:t>
       </w:r>
     </w:p>
     <w:p>
@@ -2691,55 +2413,7 @@
           <w:color w:val="5A6B73"/>
           <w:sz w:val="17"/>
         </w:rPr>
-        <w:t xml:space="preserve">图 3 </w:t>
-      </w:r>
-      <w:proofErr w:type="spellStart"/>
-      <w:r>
-        <w:rPr>
-          <w:color w:val="5A6B73"/>
-          <w:sz w:val="17"/>
-        </w:rPr>
-        <w:t>状态机图：TripPlan</w:t>
-      </w:r>
-      <w:proofErr w:type="spellEnd"/>
-      <w:r>
-        <w:rPr>
-          <w:color w:val="5A6B73"/>
-          <w:sz w:val="17"/>
-        </w:rPr>
-        <w:t xml:space="preserve"> 与 </w:t>
-      </w:r>
-      <w:proofErr w:type="spellStart"/>
-      <w:r>
-        <w:rPr>
-          <w:color w:val="5A6B73"/>
-          <w:sz w:val="17"/>
-        </w:rPr>
-        <w:t>AgentRun</w:t>
-      </w:r>
-      <w:proofErr w:type="spellEnd"/>
-      <w:r>
-        <w:rPr>
-          <w:color w:val="5A6B73"/>
-          <w:sz w:val="17"/>
-        </w:rPr>
-        <w:t xml:space="preserve"> </w:t>
-      </w:r>
-      <w:proofErr w:type="spellStart"/>
-      <w:r>
-        <w:rPr>
-          <w:color w:val="5A6B73"/>
-          <w:sz w:val="17"/>
-        </w:rPr>
-        <w:t>状态分离</w:t>
-      </w:r>
-      <w:proofErr w:type="spellEnd"/>
-      <w:r>
-        <w:rPr>
-          <w:color w:val="5A6B73"/>
-          <w:sz w:val="17"/>
-        </w:rPr>
-        <w:t>。</w:t>
+        <w:t>图 3 状态机图：TripPlan 与 AgentRun 状态分离。</w:t>
       </w:r>
     </w:p>
     <w:p>
@@ -3014,25 +2688,7 @@
           <w:sz w:val="17"/>
           <w:lang w:eastAsia="zh-CN"/>
         </w:rPr>
-        <w:t>图 7 时序图：从用户意图到</w:t>
-      </w:r>
-      <w:proofErr w:type="gramStart"/>
-      <w:r>
-        <w:rPr>
-          <w:color w:val="5A6B73"/>
-          <w:sz w:val="17"/>
-          <w:lang w:eastAsia="zh-CN"/>
-        </w:rPr>
-        <w:t>候选和</w:t>
-      </w:r>
-      <w:proofErr w:type="gramEnd"/>
-      <w:r>
-        <w:rPr>
-          <w:color w:val="5A6B73"/>
-          <w:sz w:val="17"/>
-          <w:lang w:eastAsia="zh-CN"/>
-        </w:rPr>
-        <w:t>方案卡的协作链路。</w:t>
+        <w:t>图 7 时序图：从用户意图到候选和方案卡的协作链路。</w:t>
       </w:r>
     </w:p>
     <w:p>
@@ -3498,6 +3154,559 @@
       </w:rPr>
     </w:lvl>
   </w:abstractNum>
+  <w:abstractNum w:abstractNumId="9" w15:restartNumberingAfterBreak="0">
+    <w:nsid w:val="2FB03218"/>
+    <w:multiLevelType w:val="multilevel"/>
+    <w:tmpl w:val="197C2342"/>
+    <w:lvl w:ilvl="0">
+      <w:start w:val="1"/>
+      <w:numFmt w:val="bullet"/>
+      <w:lvlText w:val=""/>
+      <w:lvlJc w:val="left"/>
+      <w:pPr>
+        <w:tabs>
+          <w:tab w:val="num" w:pos="720"/>
+        </w:tabs>
+        <w:ind w:left="720" w:hanging="360"/>
+      </w:pPr>
+      <w:rPr>
+        <w:rFonts w:ascii="Symbol" w:hAnsi="Symbol" w:hint="default"/>
+        <w:sz w:val="20"/>
+      </w:rPr>
+    </w:lvl>
+    <w:lvl w:ilvl="1" w:tentative="1">
+      <w:start w:val="1"/>
+      <w:numFmt w:val="bullet"/>
+      <w:lvlText w:val="o"/>
+      <w:lvlJc w:val="left"/>
+      <w:pPr>
+        <w:tabs>
+          <w:tab w:val="num" w:pos="1440"/>
+        </w:tabs>
+        <w:ind w:left="1440" w:hanging="360"/>
+      </w:pPr>
+      <w:rPr>
+        <w:rFonts w:ascii="Courier New" w:hAnsi="Courier New" w:hint="default"/>
+        <w:sz w:val="20"/>
+      </w:rPr>
+    </w:lvl>
+    <w:lvl w:ilvl="2" w:tentative="1">
+      <w:start w:val="1"/>
+      <w:numFmt w:val="bullet"/>
+      <w:lvlText w:val=""/>
+      <w:lvlJc w:val="left"/>
+      <w:pPr>
+        <w:tabs>
+          <w:tab w:val="num" w:pos="2160"/>
+        </w:tabs>
+        <w:ind w:left="2160" w:hanging="360"/>
+      </w:pPr>
+      <w:rPr>
+        <w:rFonts w:ascii="Wingdings" w:hAnsi="Wingdings" w:hint="default"/>
+        <w:sz w:val="20"/>
+      </w:rPr>
+    </w:lvl>
+    <w:lvl w:ilvl="3" w:tentative="1">
+      <w:start w:val="1"/>
+      <w:numFmt w:val="bullet"/>
+      <w:lvlText w:val=""/>
+      <w:lvlJc w:val="left"/>
+      <w:pPr>
+        <w:tabs>
+          <w:tab w:val="num" w:pos="2880"/>
+        </w:tabs>
+        <w:ind w:left="2880" w:hanging="360"/>
+      </w:pPr>
+      <w:rPr>
+        <w:rFonts w:ascii="Wingdings" w:hAnsi="Wingdings" w:hint="default"/>
+        <w:sz w:val="20"/>
+      </w:rPr>
+    </w:lvl>
+    <w:lvl w:ilvl="4" w:tentative="1">
+      <w:start w:val="1"/>
+      <w:numFmt w:val="bullet"/>
+      <w:lvlText w:val=""/>
+      <w:lvlJc w:val="left"/>
+      <w:pPr>
+        <w:tabs>
+          <w:tab w:val="num" w:pos="3600"/>
+        </w:tabs>
+        <w:ind w:left="3600" w:hanging="360"/>
+      </w:pPr>
+      <w:rPr>
+        <w:rFonts w:ascii="Wingdings" w:hAnsi="Wingdings" w:hint="default"/>
+        <w:sz w:val="20"/>
+      </w:rPr>
+    </w:lvl>
+    <w:lvl w:ilvl="5" w:tentative="1">
+      <w:start w:val="1"/>
+      <w:numFmt w:val="bullet"/>
+      <w:lvlText w:val=""/>
+      <w:lvlJc w:val="left"/>
+      <w:pPr>
+        <w:tabs>
+          <w:tab w:val="num" w:pos="4320"/>
+        </w:tabs>
+        <w:ind w:left="4320" w:hanging="360"/>
+      </w:pPr>
+      <w:rPr>
+        <w:rFonts w:ascii="Wingdings" w:hAnsi="Wingdings" w:hint="default"/>
+        <w:sz w:val="20"/>
+      </w:rPr>
+    </w:lvl>
+    <w:lvl w:ilvl="6" w:tentative="1">
+      <w:start w:val="1"/>
+      <w:numFmt w:val="bullet"/>
+      <w:lvlText w:val=""/>
+      <w:lvlJc w:val="left"/>
+      <w:pPr>
+        <w:tabs>
+          <w:tab w:val="num" w:pos="5040"/>
+        </w:tabs>
+        <w:ind w:left="5040" w:hanging="360"/>
+      </w:pPr>
+      <w:rPr>
+        <w:rFonts w:ascii="Wingdings" w:hAnsi="Wingdings" w:hint="default"/>
+        <w:sz w:val="20"/>
+      </w:rPr>
+    </w:lvl>
+    <w:lvl w:ilvl="7" w:tentative="1">
+      <w:start w:val="1"/>
+      <w:numFmt w:val="bullet"/>
+      <w:lvlText w:val=""/>
+      <w:lvlJc w:val="left"/>
+      <w:pPr>
+        <w:tabs>
+          <w:tab w:val="num" w:pos="5760"/>
+        </w:tabs>
+        <w:ind w:left="5760" w:hanging="360"/>
+      </w:pPr>
+      <w:rPr>
+        <w:rFonts w:ascii="Wingdings" w:hAnsi="Wingdings" w:hint="default"/>
+        <w:sz w:val="20"/>
+      </w:rPr>
+    </w:lvl>
+    <w:lvl w:ilvl="8" w:tentative="1">
+      <w:start w:val="1"/>
+      <w:numFmt w:val="bullet"/>
+      <w:lvlText w:val=""/>
+      <w:lvlJc w:val="left"/>
+      <w:pPr>
+        <w:tabs>
+          <w:tab w:val="num" w:pos="6480"/>
+        </w:tabs>
+        <w:ind w:left="6480" w:hanging="360"/>
+      </w:pPr>
+      <w:rPr>
+        <w:rFonts w:ascii="Wingdings" w:hAnsi="Wingdings" w:hint="default"/>
+        <w:sz w:val="20"/>
+      </w:rPr>
+    </w:lvl>
+  </w:abstractNum>
+  <w:abstractNum w:abstractNumId="10" w15:restartNumberingAfterBreak="0">
+    <w:nsid w:val="33E06087"/>
+    <w:multiLevelType w:val="multilevel"/>
+    <w:tmpl w:val="B2EC7B90"/>
+    <w:lvl w:ilvl="0">
+      <w:start w:val="1"/>
+      <w:numFmt w:val="decimal"/>
+      <w:lvlText w:val="%1"/>
+      <w:lvlJc w:val="left"/>
+      <w:pPr>
+        <w:ind w:left="480" w:hanging="480"/>
+      </w:pPr>
+      <w:rPr>
+        <w:rFonts w:hint="default"/>
+      </w:rPr>
+    </w:lvl>
+    <w:lvl w:ilvl="1">
+      <w:start w:val="1"/>
+      <w:numFmt w:val="decimal"/>
+      <w:lvlText w:val="%1.%2"/>
+      <w:lvlJc w:val="left"/>
+      <w:pPr>
+        <w:ind w:left="480" w:hanging="480"/>
+      </w:pPr>
+      <w:rPr>
+        <w:rFonts w:hint="default"/>
+      </w:rPr>
+    </w:lvl>
+    <w:lvl w:ilvl="2">
+      <w:start w:val="1"/>
+      <w:numFmt w:val="decimal"/>
+      <w:lvlText w:val="%1.%2.%3"/>
+      <w:lvlJc w:val="left"/>
+      <w:pPr>
+        <w:ind w:left="720" w:hanging="720"/>
+      </w:pPr>
+      <w:rPr>
+        <w:rFonts w:hint="default"/>
+      </w:rPr>
+    </w:lvl>
+    <w:lvl w:ilvl="3">
+      <w:start w:val="1"/>
+      <w:numFmt w:val="decimal"/>
+      <w:lvlText w:val="%1.%2.%3.%4"/>
+      <w:lvlJc w:val="left"/>
+      <w:pPr>
+        <w:ind w:left="720" w:hanging="720"/>
+      </w:pPr>
+      <w:rPr>
+        <w:rFonts w:hint="default"/>
+      </w:rPr>
+    </w:lvl>
+    <w:lvl w:ilvl="4">
+      <w:start w:val="1"/>
+      <w:numFmt w:val="decimal"/>
+      <w:lvlText w:val="%1.%2.%3.%4.%5"/>
+      <w:lvlJc w:val="left"/>
+      <w:pPr>
+        <w:ind w:left="1080" w:hanging="1080"/>
+      </w:pPr>
+      <w:rPr>
+        <w:rFonts w:hint="default"/>
+      </w:rPr>
+    </w:lvl>
+    <w:lvl w:ilvl="5">
+      <w:start w:val="1"/>
+      <w:numFmt w:val="decimal"/>
+      <w:lvlText w:val="%1.%2.%3.%4.%5.%6"/>
+      <w:lvlJc w:val="left"/>
+      <w:pPr>
+        <w:ind w:left="1080" w:hanging="1080"/>
+      </w:pPr>
+      <w:rPr>
+        <w:rFonts w:hint="default"/>
+      </w:rPr>
+    </w:lvl>
+    <w:lvl w:ilvl="6">
+      <w:start w:val="1"/>
+      <w:numFmt w:val="decimal"/>
+      <w:lvlText w:val="%1.%2.%3.%4.%5.%6.%7"/>
+      <w:lvlJc w:val="left"/>
+      <w:pPr>
+        <w:ind w:left="1440" w:hanging="1440"/>
+      </w:pPr>
+      <w:rPr>
+        <w:rFonts w:hint="default"/>
+      </w:rPr>
+    </w:lvl>
+    <w:lvl w:ilvl="7">
+      <w:start w:val="1"/>
+      <w:numFmt w:val="decimal"/>
+      <w:lvlText w:val="%1.%2.%3.%4.%5.%6.%7.%8"/>
+      <w:lvlJc w:val="left"/>
+      <w:pPr>
+        <w:ind w:left="1440" w:hanging="1440"/>
+      </w:pPr>
+      <w:rPr>
+        <w:rFonts w:hint="default"/>
+      </w:rPr>
+    </w:lvl>
+    <w:lvl w:ilvl="8">
+      <w:start w:val="1"/>
+      <w:numFmt w:val="decimal"/>
+      <w:lvlText w:val="%1.%2.%3.%4.%5.%6.%7.%8.%9"/>
+      <w:lvlJc w:val="left"/>
+      <w:pPr>
+        <w:ind w:left="1800" w:hanging="1800"/>
+      </w:pPr>
+      <w:rPr>
+        <w:rFonts w:hint="default"/>
+      </w:rPr>
+    </w:lvl>
+  </w:abstractNum>
+  <w:abstractNum w:abstractNumId="11" w15:restartNumberingAfterBreak="0">
+    <w:nsid w:val="44787348"/>
+    <w:multiLevelType w:val="hybridMultilevel"/>
+    <w:tmpl w:val="433E341A"/>
+    <w:lvl w:ilvl="0" w:tplc="A5BA55FE">
+      <w:start w:val="1"/>
+      <w:numFmt w:val="bullet"/>
+      <w:lvlText w:val="-"/>
+      <w:lvlJc w:val="left"/>
+      <w:pPr>
+        <w:ind w:left="360" w:hanging="360"/>
+      </w:pPr>
+      <w:rPr>
+        <w:rFonts w:ascii="微软雅黑" w:eastAsia="微软雅黑" w:hAnsi="微软雅黑" w:cstheme="minorBidi" w:hint="eastAsia"/>
+      </w:rPr>
+    </w:lvl>
+    <w:lvl w:ilvl="1" w:tplc="04090003" w:tentative="1">
+      <w:start w:val="1"/>
+      <w:numFmt w:val="bullet"/>
+      <w:lvlText w:val=""/>
+      <w:lvlJc w:val="left"/>
+      <w:pPr>
+        <w:ind w:left="880" w:hanging="440"/>
+      </w:pPr>
+      <w:rPr>
+        <w:rFonts w:ascii="Wingdings" w:hAnsi="Wingdings" w:hint="default"/>
+      </w:rPr>
+    </w:lvl>
+    <w:lvl w:ilvl="2" w:tplc="04090005" w:tentative="1">
+      <w:start w:val="1"/>
+      <w:numFmt w:val="bullet"/>
+      <w:lvlText w:val=""/>
+      <w:lvlJc w:val="left"/>
+      <w:pPr>
+        <w:ind w:left="1320" w:hanging="440"/>
+      </w:pPr>
+      <w:rPr>
+        <w:rFonts w:ascii="Wingdings" w:hAnsi="Wingdings" w:hint="default"/>
+      </w:rPr>
+    </w:lvl>
+    <w:lvl w:ilvl="3" w:tplc="04090001" w:tentative="1">
+      <w:start w:val="1"/>
+      <w:numFmt w:val="bullet"/>
+      <w:lvlText w:val=""/>
+      <w:lvlJc w:val="left"/>
+      <w:pPr>
+        <w:ind w:left="1760" w:hanging="440"/>
+      </w:pPr>
+      <w:rPr>
+        <w:rFonts w:ascii="Wingdings" w:hAnsi="Wingdings" w:hint="default"/>
+      </w:rPr>
+    </w:lvl>
+    <w:lvl w:ilvl="4" w:tplc="04090003" w:tentative="1">
+      <w:start w:val="1"/>
+      <w:numFmt w:val="bullet"/>
+      <w:lvlText w:val=""/>
+      <w:lvlJc w:val="left"/>
+      <w:pPr>
+        <w:ind w:left="2200" w:hanging="440"/>
+      </w:pPr>
+      <w:rPr>
+        <w:rFonts w:ascii="Wingdings" w:hAnsi="Wingdings" w:hint="default"/>
+      </w:rPr>
+    </w:lvl>
+    <w:lvl w:ilvl="5" w:tplc="04090005" w:tentative="1">
+      <w:start w:val="1"/>
+      <w:numFmt w:val="bullet"/>
+      <w:lvlText w:val=""/>
+      <w:lvlJc w:val="left"/>
+      <w:pPr>
+        <w:ind w:left="2640" w:hanging="440"/>
+      </w:pPr>
+      <w:rPr>
+        <w:rFonts w:ascii="Wingdings" w:hAnsi="Wingdings" w:hint="default"/>
+      </w:rPr>
+    </w:lvl>
+    <w:lvl w:ilvl="6" w:tplc="04090001" w:tentative="1">
+      <w:start w:val="1"/>
+      <w:numFmt w:val="bullet"/>
+      <w:lvlText w:val=""/>
+      <w:lvlJc w:val="left"/>
+      <w:pPr>
+        <w:ind w:left="3080" w:hanging="440"/>
+      </w:pPr>
+      <w:rPr>
+        <w:rFonts w:ascii="Wingdings" w:hAnsi="Wingdings" w:hint="default"/>
+      </w:rPr>
+    </w:lvl>
+    <w:lvl w:ilvl="7" w:tplc="04090003" w:tentative="1">
+      <w:start w:val="1"/>
+      <w:numFmt w:val="bullet"/>
+      <w:lvlText w:val=""/>
+      <w:lvlJc w:val="left"/>
+      <w:pPr>
+        <w:ind w:left="3520" w:hanging="440"/>
+      </w:pPr>
+      <w:rPr>
+        <w:rFonts w:ascii="Wingdings" w:hAnsi="Wingdings" w:hint="default"/>
+      </w:rPr>
+    </w:lvl>
+    <w:lvl w:ilvl="8" w:tplc="04090005" w:tentative="1">
+      <w:start w:val="1"/>
+      <w:numFmt w:val="bullet"/>
+      <w:lvlText w:val=""/>
+      <w:lvlJc w:val="left"/>
+      <w:pPr>
+        <w:ind w:left="3960" w:hanging="440"/>
+      </w:pPr>
+      <w:rPr>
+        <w:rFonts w:ascii="Wingdings" w:hAnsi="Wingdings" w:hint="default"/>
+      </w:rPr>
+    </w:lvl>
+  </w:abstractNum>
+  <w:abstractNum w:abstractNumId="12" w15:restartNumberingAfterBreak="0">
+    <w:nsid w:val="650132F1"/>
+    <w:multiLevelType w:val="hybridMultilevel"/>
+    <w:tmpl w:val="DB26DB52"/>
+    <w:lvl w:ilvl="0" w:tplc="C4AA5694">
+      <w:start w:val="1"/>
+      <w:numFmt w:val="decimal"/>
+      <w:lvlText w:val="%1."/>
+      <w:lvlJc w:val="left"/>
+      <w:pPr>
+        <w:ind w:left="360" w:hanging="360"/>
+      </w:pPr>
+      <w:rPr>
+        <w:rFonts w:hint="default"/>
+      </w:rPr>
+    </w:lvl>
+    <w:lvl w:ilvl="1" w:tplc="04090019" w:tentative="1">
+      <w:start w:val="1"/>
+      <w:numFmt w:val="lowerLetter"/>
+      <w:lvlText w:val="%2)"/>
+      <w:lvlJc w:val="left"/>
+      <w:pPr>
+        <w:ind w:left="880" w:hanging="440"/>
+      </w:pPr>
+    </w:lvl>
+    <w:lvl w:ilvl="2" w:tplc="0409001B" w:tentative="1">
+      <w:start w:val="1"/>
+      <w:numFmt w:val="lowerRoman"/>
+      <w:lvlText w:val="%3."/>
+      <w:lvlJc w:val="right"/>
+      <w:pPr>
+        <w:ind w:left="1320" w:hanging="440"/>
+      </w:pPr>
+    </w:lvl>
+    <w:lvl w:ilvl="3" w:tplc="0409000F" w:tentative="1">
+      <w:start w:val="1"/>
+      <w:numFmt w:val="decimal"/>
+      <w:lvlText w:val="%4."/>
+      <w:lvlJc w:val="left"/>
+      <w:pPr>
+        <w:ind w:left="1760" w:hanging="440"/>
+      </w:pPr>
+    </w:lvl>
+    <w:lvl w:ilvl="4" w:tplc="04090019" w:tentative="1">
+      <w:start w:val="1"/>
+      <w:numFmt w:val="lowerLetter"/>
+      <w:lvlText w:val="%5)"/>
+      <w:lvlJc w:val="left"/>
+      <w:pPr>
+        <w:ind w:left="2200" w:hanging="440"/>
+      </w:pPr>
+    </w:lvl>
+    <w:lvl w:ilvl="5" w:tplc="0409001B" w:tentative="1">
+      <w:start w:val="1"/>
+      <w:numFmt w:val="lowerRoman"/>
+      <w:lvlText w:val="%6."/>
+      <w:lvlJc w:val="right"/>
+      <w:pPr>
+        <w:ind w:left="2640" w:hanging="440"/>
+      </w:pPr>
+    </w:lvl>
+    <w:lvl w:ilvl="6" w:tplc="0409000F" w:tentative="1">
+      <w:start w:val="1"/>
+      <w:numFmt w:val="decimal"/>
+      <w:lvlText w:val="%7."/>
+      <w:lvlJc w:val="left"/>
+      <w:pPr>
+        <w:ind w:left="3080" w:hanging="440"/>
+      </w:pPr>
+    </w:lvl>
+    <w:lvl w:ilvl="7" w:tplc="04090019" w:tentative="1">
+      <w:start w:val="1"/>
+      <w:numFmt w:val="lowerLetter"/>
+      <w:lvlText w:val="%8)"/>
+      <w:lvlJc w:val="left"/>
+      <w:pPr>
+        <w:ind w:left="3520" w:hanging="440"/>
+      </w:pPr>
+    </w:lvl>
+    <w:lvl w:ilvl="8" w:tplc="0409001B" w:tentative="1">
+      <w:start w:val="1"/>
+      <w:numFmt w:val="lowerRoman"/>
+      <w:lvlText w:val="%9."/>
+      <w:lvlJc w:val="right"/>
+      <w:pPr>
+        <w:ind w:left="3960" w:hanging="440"/>
+      </w:pPr>
+    </w:lvl>
+  </w:abstractNum>
+  <w:abstractNum w:abstractNumId="13" w15:restartNumberingAfterBreak="0">
+    <w:nsid w:val="6E0510C7"/>
+    <w:multiLevelType w:val="hybridMultilevel"/>
+    <w:tmpl w:val="36DE31CA"/>
+    <w:lvl w:ilvl="0" w:tplc="E9FA9B9C">
+      <w:start w:val="1"/>
+      <w:numFmt w:val="decimal"/>
+      <w:lvlText w:val="%1."/>
+      <w:lvlJc w:val="left"/>
+      <w:pPr>
+        <w:ind w:left="360" w:hanging="360"/>
+      </w:pPr>
+      <w:rPr>
+        <w:rFonts w:hint="default"/>
+      </w:rPr>
+    </w:lvl>
+    <w:lvl w:ilvl="1" w:tplc="04090019" w:tentative="1">
+      <w:start w:val="1"/>
+      <w:numFmt w:val="lowerLetter"/>
+      <w:lvlText w:val="%2)"/>
+      <w:lvlJc w:val="left"/>
+      <w:pPr>
+        <w:ind w:left="880" w:hanging="440"/>
+      </w:pPr>
+    </w:lvl>
+    <w:lvl w:ilvl="2" w:tplc="0409001B" w:tentative="1">
+      <w:start w:val="1"/>
+      <w:numFmt w:val="lowerRoman"/>
+      <w:lvlText w:val="%3."/>
+      <w:lvlJc w:val="right"/>
+      <w:pPr>
+        <w:ind w:left="1320" w:hanging="440"/>
+      </w:pPr>
+    </w:lvl>
+    <w:lvl w:ilvl="3" w:tplc="0409000F" w:tentative="1">
+      <w:start w:val="1"/>
+      <w:numFmt w:val="decimal"/>
+      <w:lvlText w:val="%4."/>
+      <w:lvlJc w:val="left"/>
+      <w:pPr>
+        <w:ind w:left="1760" w:hanging="440"/>
+      </w:pPr>
+    </w:lvl>
+    <w:lvl w:ilvl="4" w:tplc="04090019" w:tentative="1">
+      <w:start w:val="1"/>
+      <w:numFmt w:val="lowerLetter"/>
+      <w:lvlText w:val="%5)"/>
+      <w:lvlJc w:val="left"/>
+      <w:pPr>
+        <w:ind w:left="2200" w:hanging="440"/>
+      </w:pPr>
+    </w:lvl>
+    <w:lvl w:ilvl="5" w:tplc="0409001B" w:tentative="1">
+      <w:start w:val="1"/>
+      <w:numFmt w:val="lowerRoman"/>
+      <w:lvlText w:val="%6."/>
+      <w:lvlJc w:val="right"/>
+      <w:pPr>
+        <w:ind w:left="2640" w:hanging="440"/>
+      </w:pPr>
+    </w:lvl>
+    <w:lvl w:ilvl="6" w:tplc="0409000F" w:tentative="1">
+      <w:start w:val="1"/>
+      <w:numFmt w:val="decimal"/>
+      <w:lvlText w:val="%7."/>
+      <w:lvlJc w:val="left"/>
+      <w:pPr>
+        <w:ind w:left="3080" w:hanging="440"/>
+      </w:pPr>
+    </w:lvl>
+    <w:lvl w:ilvl="7" w:tplc="04090019" w:tentative="1">
+      <w:start w:val="1"/>
+      <w:numFmt w:val="lowerLetter"/>
+      <w:lvlText w:val="%8)"/>
+      <w:lvlJc w:val="left"/>
+      <w:pPr>
+        <w:ind w:left="3520" w:hanging="440"/>
+      </w:pPr>
+    </w:lvl>
+    <w:lvl w:ilvl="8" w:tplc="0409001B" w:tentative="1">
+      <w:start w:val="1"/>
+      <w:numFmt w:val="lowerRoman"/>
+      <w:lvlText w:val="%9."/>
+      <w:lvlJc w:val="right"/>
+      <w:pPr>
+        <w:ind w:left="3960" w:hanging="440"/>
+      </w:pPr>
+    </w:lvl>
+  </w:abstractNum>
   <w:num w:numId="1" w16cid:durableId="2130316419">
     <w:abstractNumId w:val="8"/>
   </w:num>
@@ -3524,6 +3733,21 @@
   </w:num>
   <w:num w:numId="9" w16cid:durableId="1472020804">
     <w:abstractNumId w:val="0"/>
+  </w:num>
+  <w:num w:numId="10" w16cid:durableId="1213687997">
+    <w:abstractNumId w:val="13"/>
+  </w:num>
+  <w:num w:numId="11" w16cid:durableId="183255316">
+    <w:abstractNumId w:val="12"/>
+  </w:num>
+  <w:num w:numId="12" w16cid:durableId="2001302186">
+    <w:abstractNumId w:val="9"/>
+  </w:num>
+  <w:num w:numId="13" w16cid:durableId="1863201438">
+    <w:abstractNumId w:val="10"/>
+  </w:num>
+  <w:num w:numId="14" w16cid:durableId="835996925">
+    <w:abstractNumId w:val="11"/>
   </w:num>
 </w:numbering>
 </file>
@@ -3930,7 +4154,7 @@
     <w:link w:val="10"/>
     <w:uiPriority w:val="9"/>
     <w:qFormat/>
-    <w:rsid w:val="00FC693F"/>
+    <w:rsid w:val="007D523E"/>
     <w:pPr>
       <w:keepNext/>
       <w:keepLines/>
@@ -3942,7 +4166,7 @@
       <w:b/>
       <w:bCs/>
       <w:color w:val="365F91" w:themeColor="accent1" w:themeShade="BF"/>
-      <w:sz w:val="28"/>
+      <w:sz w:val="44"/>
       <w:szCs w:val="28"/>
     </w:rPr>
   </w:style>
@@ -3954,7 +4178,7 @@
     <w:uiPriority w:val="9"/>
     <w:unhideWhenUsed/>
     <w:qFormat/>
-    <w:rsid w:val="00FC693F"/>
+    <w:rsid w:val="007D523E"/>
     <w:pPr>
       <w:keepNext/>
       <w:keepLines/>
@@ -3965,8 +4189,7 @@
       <w:rFonts w:asciiTheme="majorHAnsi" w:eastAsiaTheme="majorEastAsia" w:hAnsiTheme="majorHAnsi" w:cstheme="majorBidi"/>
       <w:b/>
       <w:bCs/>
-      <w:color w:val="4F81BD" w:themeColor="accent1"/>
-      <w:sz w:val="26"/>
+      <w:sz w:val="24"/>
       <w:szCs w:val="26"/>
     </w:rPr>
   </w:style>
@@ -4135,7 +4358,6 @@
   <w:style w:type="character" w:default="1" w:styleId="a2">
     <w:name w:val="Default Paragraph Font"/>
     <w:uiPriority w:val="1"/>
-    <w:semiHidden/>
     <w:unhideWhenUsed/>
   </w:style>
   <w:style w:type="table" w:default="1" w:styleId="a3">
@@ -4217,13 +4439,13 @@
     <w:basedOn w:val="a2"/>
     <w:link w:val="1"/>
     <w:uiPriority w:val="9"/>
-    <w:rsid w:val="00FC693F"/>
+    <w:rsid w:val="007D523E"/>
     <w:rPr>
       <w:rFonts w:asciiTheme="majorHAnsi" w:eastAsiaTheme="majorEastAsia" w:hAnsiTheme="majorHAnsi" w:cstheme="majorBidi"/>
       <w:b/>
       <w:bCs/>
       <w:color w:val="365F91" w:themeColor="accent1" w:themeShade="BF"/>
-      <w:sz w:val="28"/>
+      <w:sz w:val="44"/>
       <w:szCs w:val="28"/>
     </w:rPr>
   </w:style>
@@ -4232,13 +4454,12 @@
     <w:basedOn w:val="a2"/>
     <w:link w:val="21"/>
     <w:uiPriority w:val="9"/>
-    <w:rsid w:val="00FC693F"/>
+    <w:rsid w:val="007D523E"/>
     <w:rPr>
       <w:rFonts w:asciiTheme="majorHAnsi" w:eastAsiaTheme="majorEastAsia" w:hAnsiTheme="majorHAnsi" w:cstheme="majorBidi"/>
       <w:b/>
       <w:bCs/>
-      <w:color w:val="4F81BD" w:themeColor="accent1"/>
-      <w:sz w:val="26"/>
+      <w:sz w:val="24"/>
       <w:szCs w:val="26"/>
     </w:rPr>
   </w:style>

</xml_diff>